<commit_message>
docs: cover the DxPS console in the HLD/LLD, installation and components guides
Install guide 1.2: console components, Node.js requirement, scripts, section 7.4
(start, first user, roles, pages, catalog changes), paths, troubleshooting, security.
Components guide 1.1: console in the component map and section 5.8 with data use
and screenshots. HLD/LLD 1.2: section 5.14 console capabilities and roles, section
6.16 console API, BFF, sessions, drafts, Template Lab and routes. Word and PDF
regenerated.
</commit_message>
<xml_diff>
--- a/DxPS_Components_and_Data_Guide.docx
+++ b/DxPS_Components_and_Data_Guide.docx
@@ -1,6 +1,6 @@
 
 <file path=word/document.xml><?xml version="1.0" encoding="utf-8"?>
-<w:document xmlns:wpc="http://schemas.microsoft.com/office/word/2010/wordprocessingCanvas" xmlns:cx="http://schemas.microsoft.com/office/drawing/2014/chartex" xmlns:cx1="http://schemas.microsoft.com/office/drawing/2015/9/8/chartex" xmlns:cx2="http://schemas.microsoft.com/office/drawing/2015/10/21/chartex" xmlns:cx3="http://schemas.microsoft.com/office/drawing/2016/5/9/chartex" xmlns:cx4="http://schemas.microsoft.com/office/drawing/2016/5/10/chartex" xmlns:cx5="http://schemas.microsoft.com/office/drawing/2016/5/11/chartex" xmlns:cx6="http://schemas.microsoft.com/office/drawing/2016/5/12/chartex" xmlns:cx7="http://schemas.microsoft.com/office/drawing/2016/5/13/chartex" xmlns:cx8="http://schemas.microsoft.com/office/drawing/2016/5/14/chartex" xmlns:mc="http://schemas.openxmlformats.org/markup-compatibility/2006" xmlns:aink="http://schemas.microsoft.com/office/drawing/2016/ink" xmlns:am3d="http://schemas.microsoft.com/office/drawing/2017/model3d" xmlns:o="urn:schemas-microsoft-com:office:office" xmlns:oel="http://schemas.microsoft.com/office/2019/extlst" xmlns:r="http://schemas.openxmlformats.org/officeDocument/2006/relationships" xmlns:m="http://schemas.openxmlformats.org/officeDocument/2006/math" xmlns:v="urn:schemas-microsoft-com:vml" xmlns:wp14="http://schemas.microsoft.com/office/word/2010/wordprocessingDrawing" xmlns:wp="http://schemas.openxmlformats.org/drawingml/2006/wordprocessingDrawing" xmlns:w10="urn:schemas-microsoft-com:office:word" xmlns:w="http://schemas.openxmlformats.org/wordprocessingml/2006/main" xmlns:w14="http://schemas.microsoft.com/office/word/2010/wordml" xmlns:w15="http://schemas.microsoft.com/office/word/2012/wordml" xmlns:w16cex="http://schemas.microsoft.com/office/word/2018/wordml/cex" xmlns:w16cid="http://schemas.microsoft.com/office/word/2016/wordml/cid" xmlns:w16="http://schemas.microsoft.com/office/word/2018/wordml" xmlns:w16du="http://schemas.microsoft.com/office/word/2023/wordml/word16du" xmlns:w16sdtdh="http://schemas.microsoft.com/office/word/2020/wordml/sdtdatahash" xmlns:w16sdtfl="http://schemas.microsoft.com/office/word/2024/wordml/sdtformatlock" xmlns:w16se="http://schemas.microsoft.com/office/word/2015/wordml/symex" xmlns:wpg="http://schemas.microsoft.com/office/word/2010/wordprocessingGroup" xmlns:wpi="http://schemas.microsoft.com/office/word/2010/wordprocessingInk" xmlns:wne="http://schemas.microsoft.com/office/word/2006/wordml" xmlns:wps="http://schemas.microsoft.com/office/word/2010/wordprocessingShape" mc:Ignorable="w14 w15 w16se w16cid w16 w16cex w16sdtdh w16sdtfl w16du wp14">
+<w:document xmlns:wpc="http://schemas.microsoft.com/office/word/2010/wordprocessingCanvas" xmlns:cx="http://schemas.microsoft.com/office/drawing/2014/chartex" xmlns:cx1="http://schemas.microsoft.com/office/drawing/2015/9/8/chartex" xmlns:cx2="http://schemas.microsoft.com/office/drawing/2015/10/21/chartex" xmlns:cx3="http://schemas.microsoft.com/office/drawing/2016/5/9/chartex" xmlns:cx4="http://schemas.microsoft.com/office/drawing/2016/5/10/chartex" xmlns:cx5="http://schemas.microsoft.com/office/drawing/2016/5/11/chartex" xmlns:cx6="http://schemas.microsoft.com/office/drawing/2016/5/12/chartex" xmlns:cx7="http://schemas.microsoft.com/office/drawing/2016/5/13/chartex" xmlns:cx8="http://schemas.microsoft.com/office/drawing/2016/5/14/chartex" xmlns:mc="http://schemas.openxmlformats.org/markup-compatibility/2006" xmlns:m="http://schemas.openxmlformats.org/officeDocument/2006/math" xmlns:aink="http://schemas.microsoft.com/office/drawing/2016/ink" xmlns:am3d="http://schemas.microsoft.com/office/drawing/2017/model3d" xmlns:oel="http://schemas.microsoft.com/office/2019/extlst" xmlns:r="http://schemas.openxmlformats.org/officeDocument/2006/relationships" xmlns:wp14="http://schemas.microsoft.com/office/word/2010/wordprocessingDrawing" xmlns:wp="http://schemas.openxmlformats.org/drawingml/2006/wordprocessingDrawing" xmlns:wpg="http://schemas.microsoft.com/office/word/2010/wordprocessingGroup" xmlns:wpi="http://schemas.microsoft.com/office/word/2010/wordprocessingInk" xmlns:wps="http://schemas.microsoft.com/office/word/2010/wordprocessingShape" xmlns:o="urn:schemas-microsoft-com:office:office" xmlns:v="urn:schemas-microsoft-com:vml" xmlns:w10="urn:schemas-microsoft-com:office:word" xmlns:w="http://schemas.openxmlformats.org/wordprocessingml/2006/main" xmlns:w14="http://schemas.microsoft.com/office/word/2010/wordml" xmlns:w15="http://schemas.microsoft.com/office/word/2012/wordml" xmlns:w16cex="http://schemas.microsoft.com/office/word/2018/wordml/cex" xmlns:w16cid="http://schemas.microsoft.com/office/word/2016/wordml/cid" xmlns:w16="http://schemas.microsoft.com/office/word/2018/wordml" xmlns:w16sdtdh="http://schemas.microsoft.com/office/word/2020/wordml/sdtdatahash" xmlns:w16sdtfl="http://schemas.microsoft.com/office/word/2024/wordml/sdtformatlock" xmlns:w16se="http://schemas.microsoft.com/office/word/2015/wordml/symex" xmlns:w16du="http://schemas.microsoft.com/office/word/2023/wordml/word16du" xmlns:wne="http://schemas.microsoft.com/office/word/2006/wordml" mc:Ignorable="w14 w15 w16se w16cid w16 w16cex w16sdtdh w16sdtfl w16du wp14">
   <w:body>
     <w:p/>
     <w:p/>
@@ -352,7 +352,7 @@
                 <w:rFonts w:eastAsia="Calibri"/>
                 <w:sz w:val="17"/>
               </w:rPr>
-              <w:t>1.0</w:t>
+              <w:t>1.1</w:t>
             </w:r>
           </w:p>
         </w:tc>
@@ -385,7 +385,7 @@
                 <w:rFonts w:eastAsia="Calibri"/>
                 <w:sz w:val="17"/>
               </w:rPr>
-              <w:t>07 October 2026</w:t>
+              <w:t>17 October 2026</w:t>
             </w:r>
           </w:p>
         </w:tc>
@@ -420,7 +420,7 @@
                 <w:rFonts w:eastAsia="Calibri"/>
                 <w:sz w:val="17"/>
               </w:rPr>
-              <w:t>dxps source of the same date; PostgreSQL 18, Apache Kafka 4.3.1, Go 1.26.6</w:t>
+              <w:t>dxps source of the same date, including the DxPS console; PostgreSQL 18, Apache Kafka 4.3.1, Go 1.26.6</w:t>
             </w:r>
           </w:p>
         </w:tc>
@@ -503,7 +503,7 @@
       <w:r>
         <w:fldChar w:fldCharType="separate"/>
       </w:r>
-      <w:hyperlink w:anchor="_Toc242269247" w:history="1">
+      <w:hyperlink w:anchor="_Toc243095573" w:history="1">
         <w:r>
           <w:rPr>
             <w:rStyle w:val="Hyperlink"/>
@@ -530,7 +530,7 @@
             <w:noProof/>
             <w:webHidden/>
           </w:rPr>
-          <w:instrText xml:space="preserve"> PAGEREF _Toc242269247 \h </w:instrText>
+          <w:instrText xml:space="preserve"> PAGEREF _Toc243095573 \h </w:instrText>
         </w:r>
         <w:r>
           <w:rPr>
@@ -571,7 +571,7 @@
           <w:noProof/>
         </w:rPr>
       </w:pPr>
-      <w:hyperlink w:anchor="_Toc242269248" w:history="1">
+      <w:hyperlink w:anchor="_Toc243095574" w:history="1">
         <w:r>
           <w:rPr>
             <w:rStyle w:val="Hyperlink"/>
@@ -598,7 +598,7 @@
             <w:noProof/>
             <w:webHidden/>
           </w:rPr>
-          <w:instrText xml:space="preserve"> PAGEREF _Toc242269248 \h </w:instrText>
+          <w:instrText xml:space="preserve"> PAGEREF _Toc243095574 \h </w:instrText>
         </w:r>
         <w:r>
           <w:rPr>
@@ -639,7 +639,7 @@
           <w:noProof/>
         </w:rPr>
       </w:pPr>
-      <w:hyperlink w:anchor="_Toc242269249" w:history="1">
+      <w:hyperlink w:anchor="_Toc243095575" w:history="1">
         <w:r>
           <w:rPr>
             <w:rStyle w:val="Hyperlink"/>
@@ -666,7 +666,7 @@
             <w:noProof/>
             <w:webHidden/>
           </w:rPr>
-          <w:instrText xml:space="preserve"> PAGEREF _Toc242269249 \h </w:instrText>
+          <w:instrText xml:space="preserve"> PAGEREF _Toc243095575 \h </w:instrText>
         </w:r>
         <w:r>
           <w:rPr>
@@ -707,7 +707,7 @@
           <w:noProof/>
         </w:rPr>
       </w:pPr>
-      <w:hyperlink w:anchor="_Toc242269250" w:history="1">
+      <w:hyperlink w:anchor="_Toc243095576" w:history="1">
         <w:r>
           <w:rPr>
             <w:rStyle w:val="Hyperlink"/>
@@ -734,7 +734,7 @@
             <w:noProof/>
             <w:webHidden/>
           </w:rPr>
-          <w:instrText xml:space="preserve"> PAGEREF _Toc242269250 \h </w:instrText>
+          <w:instrText xml:space="preserve"> PAGEREF _Toc243095576 \h </w:instrText>
         </w:r>
         <w:r>
           <w:rPr>
@@ -775,7 +775,7 @@
           <w:noProof/>
         </w:rPr>
       </w:pPr>
-      <w:hyperlink w:anchor="_Toc242269251" w:history="1">
+      <w:hyperlink w:anchor="_Toc243095577" w:history="1">
         <w:r>
           <w:rPr>
             <w:rStyle w:val="Hyperlink"/>
@@ -802,7 +802,7 @@
             <w:noProof/>
             <w:webHidden/>
           </w:rPr>
-          <w:instrText xml:space="preserve"> PAGEREF _Toc242269251 \h </w:instrText>
+          <w:instrText xml:space="preserve"> PAGEREF _Toc243095577 \h </w:instrText>
         </w:r>
         <w:r>
           <w:rPr>
@@ -843,7 +843,7 @@
           <w:noProof/>
         </w:rPr>
       </w:pPr>
-      <w:hyperlink w:anchor="_Toc242269252" w:history="1">
+      <w:hyperlink w:anchor="_Toc243095578" w:history="1">
         <w:r>
           <w:rPr>
             <w:rStyle w:val="Hyperlink"/>
@@ -870,7 +870,7 @@
             <w:noProof/>
             <w:webHidden/>
           </w:rPr>
-          <w:instrText xml:space="preserve"> PAGEREF _Toc242269252 \h </w:instrText>
+          <w:instrText xml:space="preserve"> PAGEREF _Toc243095578 \h </w:instrText>
         </w:r>
         <w:r>
           <w:rPr>
@@ -911,7 +911,7 @@
           <w:noProof/>
         </w:rPr>
       </w:pPr>
-      <w:hyperlink w:anchor="_Toc242269253" w:history="1">
+      <w:hyperlink w:anchor="_Toc243095579" w:history="1">
         <w:r>
           <w:rPr>
             <w:rStyle w:val="Hyperlink"/>
@@ -938,7 +938,7 @@
             <w:noProof/>
             <w:webHidden/>
           </w:rPr>
-          <w:instrText xml:space="preserve"> PAGEREF _Toc242269253 \h </w:instrText>
+          <w:instrText xml:space="preserve"> PAGEREF _Toc243095579 \h </w:instrText>
         </w:r>
         <w:r>
           <w:rPr>
@@ -979,7 +979,7 @@
           <w:noProof/>
         </w:rPr>
       </w:pPr>
-      <w:hyperlink w:anchor="_Toc242269254" w:history="1">
+      <w:hyperlink w:anchor="_Toc243095580" w:history="1">
         <w:r>
           <w:rPr>
             <w:rStyle w:val="Hyperlink"/>
@@ -1006,7 +1006,7 @@
             <w:noProof/>
             <w:webHidden/>
           </w:rPr>
-          <w:instrText xml:space="preserve"> PAGEREF _Toc242269254 \h </w:instrText>
+          <w:instrText xml:space="preserve"> PAGEREF _Toc243095580 \h </w:instrText>
         </w:r>
         <w:r>
           <w:rPr>
@@ -1047,7 +1047,7 @@
           <w:noProof/>
         </w:rPr>
       </w:pPr>
-      <w:hyperlink w:anchor="_Toc242269255" w:history="1">
+      <w:hyperlink w:anchor="_Toc243095581" w:history="1">
         <w:r>
           <w:rPr>
             <w:rStyle w:val="Hyperlink"/>
@@ -1074,7 +1074,7 @@
             <w:noProof/>
             <w:webHidden/>
           </w:rPr>
-          <w:instrText xml:space="preserve"> PAGEREF _Toc242269255 \h </w:instrText>
+          <w:instrText xml:space="preserve"> PAGEREF _Toc243095581 \h </w:instrText>
         </w:r>
         <w:r>
           <w:rPr>
@@ -1115,7 +1115,7 @@
           <w:noProof/>
         </w:rPr>
       </w:pPr>
-      <w:hyperlink w:anchor="_Toc242269256" w:history="1">
+      <w:hyperlink w:anchor="_Toc243095582" w:history="1">
         <w:r>
           <w:rPr>
             <w:rStyle w:val="Hyperlink"/>
@@ -1142,7 +1142,7 @@
             <w:noProof/>
             <w:webHidden/>
           </w:rPr>
-          <w:instrText xml:space="preserve"> PAGEREF _Toc242269256 \h </w:instrText>
+          <w:instrText xml:space="preserve"> PAGEREF _Toc243095582 \h </w:instrText>
         </w:r>
         <w:r>
           <w:rPr>
@@ -1183,7 +1183,7 @@
           <w:noProof/>
         </w:rPr>
       </w:pPr>
-      <w:hyperlink w:anchor="_Toc242269257" w:history="1">
+      <w:hyperlink w:anchor="_Toc243095583" w:history="1">
         <w:r>
           <w:rPr>
             <w:rStyle w:val="Hyperlink"/>
@@ -1210,7 +1210,7 @@
             <w:noProof/>
             <w:webHidden/>
           </w:rPr>
-          <w:instrText xml:space="preserve"> PAGEREF _Toc242269257 \h </w:instrText>
+          <w:instrText xml:space="preserve"> PAGEREF _Toc243095583 \h </w:instrText>
         </w:r>
         <w:r>
           <w:rPr>
@@ -1251,7 +1251,7 @@
           <w:noProof/>
         </w:rPr>
       </w:pPr>
-      <w:hyperlink w:anchor="_Toc242269258" w:history="1">
+      <w:hyperlink w:anchor="_Toc243095584" w:history="1">
         <w:r>
           <w:rPr>
             <w:rStyle w:val="Hyperlink"/>
@@ -1278,7 +1278,7 @@
             <w:noProof/>
             <w:webHidden/>
           </w:rPr>
-          <w:instrText xml:space="preserve"> PAGEREF _Toc242269258 \h </w:instrText>
+          <w:instrText xml:space="preserve"> PAGEREF _Toc243095584 \h </w:instrText>
         </w:r>
         <w:r>
           <w:rPr>
@@ -1319,7 +1319,7 @@
           <w:noProof/>
         </w:rPr>
       </w:pPr>
-      <w:hyperlink w:anchor="_Toc242269259" w:history="1">
+      <w:hyperlink w:anchor="_Toc243095585" w:history="1">
         <w:r>
           <w:rPr>
             <w:rStyle w:val="Hyperlink"/>
@@ -1346,7 +1346,7 @@
             <w:noProof/>
             <w:webHidden/>
           </w:rPr>
-          <w:instrText xml:space="preserve"> PAGEREF _Toc242269259 \h </w:instrText>
+          <w:instrText xml:space="preserve"> PAGEREF _Toc243095585 \h </w:instrText>
         </w:r>
         <w:r>
           <w:rPr>
@@ -1387,7 +1387,7 @@
           <w:noProof/>
         </w:rPr>
       </w:pPr>
-      <w:hyperlink w:anchor="_Toc242269260" w:history="1">
+      <w:hyperlink w:anchor="_Toc243095586" w:history="1">
         <w:r>
           <w:rPr>
             <w:rStyle w:val="Hyperlink"/>
@@ -1414,7 +1414,7 @@
             <w:noProof/>
             <w:webHidden/>
           </w:rPr>
-          <w:instrText xml:space="preserve"> PAGEREF _Toc242269260 \h </w:instrText>
+          <w:instrText xml:space="preserve"> PAGEREF _Toc243095586 \h </w:instrText>
         </w:r>
         <w:r>
           <w:rPr>
@@ -1455,7 +1455,7 @@
           <w:noProof/>
         </w:rPr>
       </w:pPr>
-      <w:hyperlink w:anchor="_Toc242269261" w:history="1">
+      <w:hyperlink w:anchor="_Toc243095587" w:history="1">
         <w:r>
           <w:rPr>
             <w:rStyle w:val="Hyperlink"/>
@@ -1482,7 +1482,7 @@
             <w:noProof/>
             <w:webHidden/>
           </w:rPr>
-          <w:instrText xml:space="preserve"> PAGEREF _Toc242269261 \h </w:instrText>
+          <w:instrText xml:space="preserve"> PAGEREF _Toc243095587 \h </w:instrText>
         </w:r>
         <w:r>
           <w:rPr>
@@ -1523,7 +1523,7 @@
           <w:noProof/>
         </w:rPr>
       </w:pPr>
-      <w:hyperlink w:anchor="_Toc242269262" w:history="1">
+      <w:hyperlink w:anchor="_Toc243095588" w:history="1">
         <w:r>
           <w:rPr>
             <w:rStyle w:val="Hyperlink"/>
@@ -1550,7 +1550,7 @@
             <w:noProof/>
             <w:webHidden/>
           </w:rPr>
-          <w:instrText xml:space="preserve"> PAGEREF _Toc242269262 \h </w:instrText>
+          <w:instrText xml:space="preserve"> PAGEREF _Toc243095588 \h </w:instrText>
         </w:r>
         <w:r>
           <w:rPr>
@@ -1591,7 +1591,7 @@
           <w:noProof/>
         </w:rPr>
       </w:pPr>
-      <w:hyperlink w:anchor="_Toc242269263" w:history="1">
+      <w:hyperlink w:anchor="_Toc243095589" w:history="1">
         <w:r>
           <w:rPr>
             <w:rStyle w:val="Hyperlink"/>
@@ -1618,7 +1618,7 @@
             <w:noProof/>
             <w:webHidden/>
           </w:rPr>
-          <w:instrText xml:space="preserve"> PAGEREF _Toc242269263 \h </w:instrText>
+          <w:instrText xml:space="preserve"> PAGEREF _Toc243095589 \h </w:instrText>
         </w:r>
         <w:r>
           <w:rPr>
@@ -1659,7 +1659,7 @@
           <w:noProof/>
         </w:rPr>
       </w:pPr>
-      <w:hyperlink w:anchor="_Toc242269264" w:history="1">
+      <w:hyperlink w:anchor="_Toc243095590" w:history="1">
         <w:r>
           <w:rPr>
             <w:rStyle w:val="Hyperlink"/>
@@ -1686,7 +1686,7 @@
             <w:noProof/>
             <w:webHidden/>
           </w:rPr>
-          <w:instrText xml:space="preserve"> PAGEREF _Toc242269264 \h </w:instrText>
+          <w:instrText xml:space="preserve"> PAGEREF _Toc243095590 \h </w:instrText>
         </w:r>
         <w:r>
           <w:rPr>
@@ -1727,7 +1727,7 @@
           <w:noProof/>
         </w:rPr>
       </w:pPr>
-      <w:hyperlink w:anchor="_Toc242269265" w:history="1">
+      <w:hyperlink w:anchor="_Toc243095591" w:history="1">
         <w:r>
           <w:rPr>
             <w:rStyle w:val="Hyperlink"/>
@@ -1754,7 +1754,7 @@
             <w:noProof/>
             <w:webHidden/>
           </w:rPr>
-          <w:instrText xml:space="preserve"> PAGEREF _Toc242269265 \h </w:instrText>
+          <w:instrText xml:space="preserve"> PAGEREF _Toc243095591 \h </w:instrText>
         </w:r>
         <w:r>
           <w:rPr>
@@ -1795,7 +1795,7 @@
           <w:noProof/>
         </w:rPr>
       </w:pPr>
-      <w:hyperlink w:anchor="_Toc242269266" w:history="1">
+      <w:hyperlink w:anchor="_Toc243095592" w:history="1">
         <w:r>
           <w:rPr>
             <w:rStyle w:val="Hyperlink"/>
@@ -1822,7 +1822,7 @@
             <w:noProof/>
             <w:webHidden/>
           </w:rPr>
-          <w:instrText xml:space="preserve"> PAGEREF _Toc242269266 \h </w:instrText>
+          <w:instrText xml:space="preserve"> PAGEREF _Toc243095592 \h </w:instrText>
         </w:r>
         <w:r>
           <w:rPr>
@@ -1863,7 +1863,7 @@
           <w:noProof/>
         </w:rPr>
       </w:pPr>
-      <w:hyperlink w:anchor="_Toc242269267" w:history="1">
+      <w:hyperlink w:anchor="_Toc243095593" w:history="1">
         <w:r>
           <w:rPr>
             <w:rStyle w:val="Hyperlink"/>
@@ -1890,7 +1890,7 @@
             <w:noProof/>
             <w:webHidden/>
           </w:rPr>
-          <w:instrText xml:space="preserve"> PAGEREF _Toc242269267 \h </w:instrText>
+          <w:instrText xml:space="preserve"> PAGEREF _Toc243095593 \h </w:instrText>
         </w:r>
         <w:r>
           <w:rPr>
@@ -1931,7 +1931,7 @@
           <w:noProof/>
         </w:rPr>
       </w:pPr>
-      <w:hyperlink w:anchor="_Toc242269268" w:history="1">
+      <w:hyperlink w:anchor="_Toc243095594" w:history="1">
         <w:r>
           <w:rPr>
             <w:rStyle w:val="Hyperlink"/>
@@ -1958,7 +1958,7 @@
             <w:noProof/>
             <w:webHidden/>
           </w:rPr>
-          <w:instrText xml:space="preserve"> PAGEREF _Toc242269268 \h </w:instrText>
+          <w:instrText xml:space="preserve"> PAGEREF _Toc243095594 \h </w:instrText>
         </w:r>
         <w:r>
           <w:rPr>
@@ -1999,7 +1999,7 @@
           <w:noProof/>
         </w:rPr>
       </w:pPr>
-      <w:hyperlink w:anchor="_Toc242269269" w:history="1">
+      <w:hyperlink w:anchor="_Toc243095595" w:history="1">
         <w:r>
           <w:rPr>
             <w:rStyle w:val="Hyperlink"/>
@@ -2026,7 +2026,7 @@
             <w:noProof/>
             <w:webHidden/>
           </w:rPr>
-          <w:instrText xml:space="preserve"> PAGEREF _Toc242269269 \h </w:instrText>
+          <w:instrText xml:space="preserve"> PAGEREF _Toc243095595 \h </w:instrText>
         </w:r>
         <w:r>
           <w:rPr>
@@ -2067,7 +2067,7 @@
           <w:noProof/>
         </w:rPr>
       </w:pPr>
-      <w:hyperlink w:anchor="_Toc242269270" w:history="1">
+      <w:hyperlink w:anchor="_Toc243095596" w:history="1">
         <w:r>
           <w:rPr>
             <w:rStyle w:val="Hyperlink"/>
@@ -2094,7 +2094,7 @@
             <w:noProof/>
             <w:webHidden/>
           </w:rPr>
-          <w:instrText xml:space="preserve"> PAGEREF _Toc242269270 \h </w:instrText>
+          <w:instrText xml:space="preserve"> PAGEREF _Toc243095596 \h </w:instrText>
         </w:r>
         <w:r>
           <w:rPr>
@@ -2135,7 +2135,7 @@
           <w:noProof/>
         </w:rPr>
       </w:pPr>
-      <w:hyperlink w:anchor="_Toc242269271" w:history="1">
+      <w:hyperlink w:anchor="_Toc243095597" w:history="1">
         <w:r>
           <w:rPr>
             <w:rStyle w:val="Hyperlink"/>
@@ -2162,7 +2162,7 @@
             <w:noProof/>
             <w:webHidden/>
           </w:rPr>
-          <w:instrText xml:space="preserve"> PAGEREF _Toc242269271 \h </w:instrText>
+          <w:instrText xml:space="preserve"> PAGEREF _Toc243095597 \h </w:instrText>
         </w:r>
         <w:r>
           <w:rPr>
@@ -2203,7 +2203,7 @@
           <w:noProof/>
         </w:rPr>
       </w:pPr>
-      <w:hyperlink w:anchor="_Toc242269272" w:history="1">
+      <w:hyperlink w:anchor="_Toc243095598" w:history="1">
         <w:r>
           <w:rPr>
             <w:rStyle w:val="Hyperlink"/>
@@ -2230,7 +2230,7 @@
             <w:noProof/>
             <w:webHidden/>
           </w:rPr>
-          <w:instrText xml:space="preserve"> PAGEREF _Toc242269272 \h </w:instrText>
+          <w:instrText xml:space="preserve"> PAGEREF _Toc243095598 \h </w:instrText>
         </w:r>
         <w:r>
           <w:rPr>
@@ -2271,7 +2271,7 @@
           <w:noProof/>
         </w:rPr>
       </w:pPr>
-      <w:hyperlink w:anchor="_Toc242269273" w:history="1">
+      <w:hyperlink w:anchor="_Toc243095599" w:history="1">
         <w:r>
           <w:rPr>
             <w:rStyle w:val="Hyperlink"/>
@@ -2298,7 +2298,7 @@
             <w:noProof/>
             <w:webHidden/>
           </w:rPr>
-          <w:instrText xml:space="preserve"> PAGEREF _Toc242269273 \h </w:instrText>
+          <w:instrText xml:space="preserve"> PAGEREF _Toc243095599 \h </w:instrText>
         </w:r>
         <w:r>
           <w:rPr>
@@ -2339,7 +2339,7 @@
           <w:noProof/>
         </w:rPr>
       </w:pPr>
-      <w:hyperlink w:anchor="_Toc242269274" w:history="1">
+      <w:hyperlink w:anchor="_Toc243095600" w:history="1">
         <w:r>
           <w:rPr>
             <w:rStyle w:val="Hyperlink"/>
@@ -2366,7 +2366,7 @@
             <w:noProof/>
             <w:webHidden/>
           </w:rPr>
-          <w:instrText xml:space="preserve"> PAGEREF _Toc242269274 \h </w:instrText>
+          <w:instrText xml:space="preserve"> PAGEREF _Toc243095600 \h </w:instrText>
         </w:r>
         <w:r>
           <w:rPr>
@@ -2407,7 +2407,7 @@
           <w:noProof/>
         </w:rPr>
       </w:pPr>
-      <w:hyperlink w:anchor="_Toc242269275" w:history="1">
+      <w:hyperlink w:anchor="_Toc243095601" w:history="1">
         <w:r>
           <w:rPr>
             <w:rStyle w:val="Hyperlink"/>
@@ -2434,7 +2434,7 @@
             <w:noProof/>
             <w:webHidden/>
           </w:rPr>
-          <w:instrText xml:space="preserve"> PAGEREF _Toc242269275 \h </w:instrText>
+          <w:instrText xml:space="preserve"> PAGEREF _Toc243095601 \h </w:instrText>
         </w:r>
         <w:r>
           <w:rPr>
@@ -2475,13 +2475,13 @@
           <w:noProof/>
         </w:rPr>
       </w:pPr>
-      <w:hyperlink w:anchor="_Toc242269276" w:history="1">
+      <w:hyperlink w:anchor="_Toc243095602" w:history="1">
         <w:r>
           <w:rPr>
             <w:rStyle w:val="Hyperlink"/>
             <w:noProof/>
           </w:rPr>
-          <w:t>5.8 PKI, secrets and dxpsctl</w:t>
+          <w:t>5.8 DxPS console</w:t>
         </w:r>
         <w:r>
           <w:rPr>
@@ -2502,7 +2502,7 @@
             <w:noProof/>
             <w:webHidden/>
           </w:rPr>
-          <w:instrText xml:space="preserve"> PAGEREF _Toc242269276 \h </w:instrText>
+          <w:instrText xml:space="preserve"> PAGEREF _Toc243095602 \h </w:instrText>
         </w:r>
         <w:r>
           <w:rPr>
@@ -2535,6 +2535,74 @@
     </w:p>
     <w:p>
       <w:pPr>
+        <w:pStyle w:val="TOC2"/>
+        <w:tabs>
+          <w:tab w:val="right" w:leader="dot" w:pos="10214"/>
+        </w:tabs>
+        <w:rPr>
+          <w:noProof/>
+        </w:rPr>
+      </w:pPr>
+      <w:hyperlink w:anchor="_Toc243095603" w:history="1">
+        <w:r>
+          <w:rPr>
+            <w:rStyle w:val="Hyperlink"/>
+            <w:noProof/>
+          </w:rPr>
+          <w:t>5.9 PKI, secrets and dxpsctl</w:t>
+        </w:r>
+        <w:r>
+          <w:rPr>
+            <w:noProof/>
+            <w:webHidden/>
+          </w:rPr>
+          <w:tab/>
+        </w:r>
+        <w:r>
+          <w:rPr>
+            <w:noProof/>
+            <w:webHidden/>
+          </w:rPr>
+          <w:fldChar w:fldCharType="begin"/>
+        </w:r>
+        <w:r>
+          <w:rPr>
+            <w:noProof/>
+            <w:webHidden/>
+          </w:rPr>
+          <w:instrText xml:space="preserve"> PAGEREF _Toc243095603 \h </w:instrText>
+        </w:r>
+        <w:r>
+          <w:rPr>
+            <w:noProof/>
+            <w:webHidden/>
+          </w:rPr>
+        </w:r>
+        <w:r>
+          <w:rPr>
+            <w:noProof/>
+            <w:webHidden/>
+          </w:rPr>
+          <w:fldChar w:fldCharType="separate"/>
+        </w:r>
+        <w:r>
+          <w:rPr>
+            <w:noProof/>
+            <w:webHidden/>
+          </w:rPr>
+          <w:t>17</w:t>
+        </w:r>
+        <w:r>
+          <w:rPr>
+            <w:noProof/>
+            <w:webHidden/>
+          </w:rPr>
+          <w:fldChar w:fldCharType="end"/>
+        </w:r>
+      </w:hyperlink>
+    </w:p>
+    <w:p>
+      <w:pPr>
         <w:pStyle w:val="TOC1"/>
         <w:tabs>
           <w:tab w:val="right" w:leader="dot" w:pos="10214"/>
@@ -2543,7 +2611,7 @@
           <w:noProof/>
         </w:rPr>
       </w:pPr>
-      <w:hyperlink w:anchor="_Toc242269277" w:history="1">
+      <w:hyperlink w:anchor="_Toc243095604" w:history="1">
         <w:r>
           <w:rPr>
             <w:rStyle w:val="Hyperlink"/>
@@ -2570,7 +2638,7 @@
             <w:noProof/>
             <w:webHidden/>
           </w:rPr>
-          <w:instrText xml:space="preserve"> PAGEREF _Toc242269277 \h </w:instrText>
+          <w:instrText xml:space="preserve"> PAGEREF _Toc243095604 \h </w:instrText>
         </w:r>
         <w:r>
           <w:rPr>
@@ -2590,7 +2658,7 @@
             <w:noProof/>
             <w:webHidden/>
           </w:rPr>
-          <w:t>15</w:t>
+          <w:t>18</w:t>
         </w:r>
         <w:r>
           <w:rPr>
@@ -2615,7 +2683,7 @@
       <w:pPr>
         <w:pStyle w:val="Heading1"/>
       </w:pPr>
-      <w:bookmarkStart w:id="0" w:name="_Toc242269247"/>
+      <w:bookmarkStart w:id="0" w:name="_Toc243095573"/>
       <w:r>
         <w:rPr>
           <w:color w:val="1E3A8A"/>
@@ -2653,7 +2721,7 @@
           <w:noProof/>
         </w:rPr>
         <w:drawing>
-          <wp:inline distT="0" distB="0" distL="0" distR="0" wp14:anchorId="1DC12459" wp14:editId="159C3138">
+          <wp:inline distT="0" distB="0" distL="0" distR="0" wp14:anchorId="352AD728" wp14:editId="478CF492">
             <wp:extent cx="6217920" cy="3777175"/>
             <wp:effectExtent l="0" t="0" r="0" b="0"/>
             <wp:docPr id="1" name="Picture 1"/>
@@ -3370,7 +3438,7 @@
                 <w:rFonts w:eastAsia="Calibri"/>
                 <w:sz w:val="15"/>
               </w:rPr>
-              <w:t>dxpsctl</w:t>
+              <w:t>DxPS console</w:t>
             </w:r>
           </w:p>
         </w:tc>
@@ -3385,7 +3453,7 @@
                 <w:rFonts w:eastAsia="Calibri"/>
                 <w:sz w:val="15"/>
               </w:rPr>
-              <w:t>Go CLI</w:t>
+              <w:t>Go API + Next.js 16 UI</w:t>
             </w:r>
           </w:p>
         </w:tc>
@@ -3400,7 +3468,7 @@
                 <w:rFonts w:eastAsia="Calibri"/>
                 <w:sz w:val="15"/>
               </w:rPr>
-              <w:t>Secrets, PKI, migrations, seed, topics, tokens, DLQ re-drive, API calls, trace, test report</w:t>
+              <w:t>Signed-in operations and configuration console: orders, DLQ, simulators, catalog drafts, Template Lab, tenants, NE inventory, reports, users</w:t>
             </w:r>
           </w:p>
         </w:tc>
@@ -3408,6 +3476,67 @@
           <w:tcPr>
             <w:tcW w:w="2160" w:type="dxa"/>
             <w:shd w:val="clear" w:color="auto" w:fill="F1F5F9"/>
+          </w:tcPr>
+          <w:p>
+            <w:r>
+              <w:rPr>
+                <w:rFonts w:eastAsia="Calibri"/>
+                <w:sz w:val="15"/>
+              </w:rPr>
+              <w:t>cmd/console, internal/console, console/</w:t>
+            </w:r>
+          </w:p>
+        </w:tc>
+      </w:tr>
+      <w:tr>
+        <w:trPr>
+          <w:jc w:val="center"/>
+        </w:trPr>
+        <w:tc>
+          <w:tcPr>
+            <w:tcW w:w="2232" w:type="dxa"/>
+          </w:tcPr>
+          <w:p>
+            <w:r>
+              <w:rPr>
+                <w:rFonts w:eastAsia="Calibri"/>
+                <w:sz w:val="15"/>
+              </w:rPr>
+              <w:t>dxpsctl</w:t>
+            </w:r>
+          </w:p>
+        </w:tc>
+        <w:tc>
+          <w:tcPr>
+            <w:tcW w:w="2088" w:type="dxa"/>
+          </w:tcPr>
+          <w:p>
+            <w:r>
+              <w:rPr>
+                <w:rFonts w:eastAsia="Calibri"/>
+                <w:sz w:val="15"/>
+              </w:rPr>
+              <w:t>Go CLI</w:t>
+            </w:r>
+          </w:p>
+        </w:tc>
+        <w:tc>
+          <w:tcPr>
+            <w:tcW w:w="3744" w:type="dxa"/>
+          </w:tcPr>
+          <w:p>
+            <w:r>
+              <w:rPr>
+                <w:rFonts w:eastAsia="Calibri"/>
+                <w:sz w:val="15"/>
+              </w:rPr>
+              <w:t>Secrets, PKI, migrations, seed, topics, tokens, DLQ re-drive, API calls, trace, test report</w:t>
+            </w:r>
+          </w:p>
+        </w:tc>
+        <w:tc>
+          <w:tcPr>
+            <w:tcW w:w="2160" w:type="dxa"/>
           </w:tcPr>
           <w:p>
             <w:r>
@@ -3435,7 +3564,7 @@
       <w:pPr>
         <w:pStyle w:val="Heading1"/>
       </w:pPr>
-      <w:bookmarkStart w:id="1" w:name="_Toc242269248"/>
+      <w:bookmarkStart w:id="1" w:name="_Toc243095574"/>
       <w:r>
         <w:rPr>
           <w:color w:val="1E3A8A"/>
@@ -4188,7 +4317,7 @@
       <w:pPr>
         <w:pStyle w:val="Heading1"/>
       </w:pPr>
-      <w:bookmarkStart w:id="2" w:name="_Toc242269249"/>
+      <w:bookmarkStart w:id="2" w:name="_Toc243095575"/>
       <w:r>
         <w:rPr>
           <w:color w:val="1E3A8A"/>
@@ -4202,7 +4331,7 @@
       <w:pPr>
         <w:pStyle w:val="Heading2"/>
       </w:pPr>
-      <w:bookmarkStart w:id="3" w:name="_Toc242269250"/>
+      <w:bookmarkStart w:id="3" w:name="_Toc243095576"/>
       <w:r>
         <w:rPr>
           <w:color w:val="1E3A8A"/>
@@ -4254,7 +4383,7 @@
       <w:pPr>
         <w:pStyle w:val="Heading2"/>
       </w:pPr>
-      <w:bookmarkStart w:id="4" w:name="_Toc242269251"/>
+      <w:bookmarkStart w:id="4" w:name="_Toc243095577"/>
       <w:r>
         <w:rPr>
           <w:color w:val="1E3A8A"/>
@@ -4558,7 +4687,7 @@
       <w:pPr>
         <w:pStyle w:val="Heading2"/>
       </w:pPr>
-      <w:bookmarkStart w:id="5" w:name="_Toc242269252"/>
+      <w:bookmarkStart w:id="5" w:name="_Toc243095578"/>
       <w:r>
         <w:rPr>
           <w:color w:val="1E3A8A"/>
@@ -4808,7 +4937,7 @@
       <w:pPr>
         <w:pStyle w:val="Heading2"/>
       </w:pPr>
-      <w:bookmarkStart w:id="6" w:name="_Toc242269253"/>
+      <w:bookmarkStart w:id="6" w:name="_Toc243095579"/>
       <w:r>
         <w:rPr>
           <w:color w:val="1E3A8A"/>
@@ -4827,7 +4956,7 @@
           <w:noProof/>
         </w:rPr>
         <w:drawing>
-          <wp:inline distT="0" distB="0" distL="0" distR="0" wp14:anchorId="2418DE61" wp14:editId="6917E915">
+          <wp:inline distT="0" distB="0" distL="0" distR="0" wp14:anchorId="058F531E" wp14:editId="667463B6">
             <wp:extent cx="6217920" cy="4202013"/>
             <wp:effectExtent l="0" t="0" r="0" b="0"/>
             <wp:docPr id="2" name="Picture 2"/>
@@ -6052,7 +6181,7 @@
       <w:pPr>
         <w:pStyle w:val="Heading2"/>
       </w:pPr>
-      <w:bookmarkStart w:id="7" w:name="_Toc242269254"/>
+      <w:bookmarkStart w:id="7" w:name="_Toc243095580"/>
       <w:r>
         <w:rPr>
           <w:color w:val="1E3A8A"/>
@@ -6104,7 +6233,7 @@
       <w:pPr>
         <w:pStyle w:val="Heading2"/>
       </w:pPr>
-      <w:bookmarkStart w:id="8" w:name="_Toc242269255"/>
+      <w:bookmarkStart w:id="8" w:name="_Toc243095581"/>
       <w:r>
         <w:rPr>
           <w:color w:val="1E3A8A"/>
@@ -7810,7 +7939,7 @@
       <w:pPr>
         <w:pStyle w:val="Heading2"/>
       </w:pPr>
-      <w:bookmarkStart w:id="9" w:name="_Toc242269256"/>
+      <w:bookmarkStart w:id="9" w:name="_Toc243095582"/>
       <w:r>
         <w:rPr>
           <w:color w:val="1E3A8A"/>
@@ -8431,7 +8560,7 @@
       <w:pPr>
         <w:pStyle w:val="Heading2"/>
       </w:pPr>
-      <w:bookmarkStart w:id="10" w:name="_Toc242269257"/>
+      <w:bookmarkStart w:id="10" w:name="_Toc243095583"/>
       <w:r>
         <w:rPr>
           <w:color w:val="1E3A8A"/>
@@ -8509,7 +8638,7 @@
       <w:pPr>
         <w:pStyle w:val="Heading2"/>
       </w:pPr>
-      <w:bookmarkStart w:id="11" w:name="_Toc242269258"/>
+      <w:bookmarkStart w:id="11" w:name="_Toc243095584"/>
       <w:r>
         <w:rPr>
           <w:color w:val="1E3A8A"/>
@@ -8768,7 +8897,7 @@
       <w:pPr>
         <w:pStyle w:val="Heading1"/>
       </w:pPr>
-      <w:bookmarkStart w:id="12" w:name="_Toc242269259"/>
+      <w:bookmarkStart w:id="12" w:name="_Toc243095585"/>
       <w:r>
         <w:rPr>
           <w:color w:val="1E3A8A"/>
@@ -8782,7 +8911,7 @@
       <w:pPr>
         <w:pStyle w:val="Heading2"/>
       </w:pPr>
-      <w:bookmarkStart w:id="13" w:name="_Toc242269260"/>
+      <w:bookmarkStart w:id="13" w:name="_Toc243095586"/>
       <w:r>
         <w:rPr>
           <w:color w:val="1E3A8A"/>
@@ -8865,7 +8994,7 @@
           <w:noProof/>
         </w:rPr>
         <w:drawing>
-          <wp:inline distT="0" distB="0" distL="0" distR="0" wp14:anchorId="5555AD29" wp14:editId="52E0D243">
+          <wp:inline distT="0" distB="0" distL="0" distR="0" wp14:anchorId="1A2237B4" wp14:editId="2DBFAE29">
             <wp:extent cx="6217920" cy="3471203"/>
             <wp:effectExtent l="0" t="0" r="0" b="0"/>
             <wp:docPr id="3" name="Picture 3"/>
@@ -8920,7 +9049,7 @@
       <w:pPr>
         <w:pStyle w:val="Heading2"/>
       </w:pPr>
-      <w:bookmarkStart w:id="14" w:name="_Toc242269261"/>
+      <w:bookmarkStart w:id="14" w:name="_Toc243095587"/>
       <w:r>
         <w:rPr>
           <w:color w:val="1E3A8A"/>
@@ -9603,7 +9732,7 @@
       <w:pPr>
         <w:pStyle w:val="Heading2"/>
       </w:pPr>
-      <w:bookmarkStart w:id="15" w:name="_Toc242269262"/>
+      <w:bookmarkStart w:id="15" w:name="_Toc243095588"/>
       <w:r>
         <w:rPr>
           <w:color w:val="1E3A8A"/>
@@ -10199,7 +10328,7 @@
       <w:pPr>
         <w:pStyle w:val="Heading2"/>
       </w:pPr>
-      <w:bookmarkStart w:id="16" w:name="_Toc242269263"/>
+      <w:bookmarkStart w:id="16" w:name="_Toc243095589"/>
       <w:r>
         <w:rPr>
           <w:color w:val="1E3A8A"/>
@@ -10571,7 +10700,7 @@
       <w:pPr>
         <w:pStyle w:val="Heading2"/>
       </w:pPr>
-      <w:bookmarkStart w:id="17" w:name="_Toc242269264"/>
+      <w:bookmarkStart w:id="17" w:name="_Toc243095590"/>
       <w:r>
         <w:rPr>
           <w:color w:val="1E3A8A"/>
@@ -10802,7 +10931,7 @@
       <w:pPr>
         <w:pStyle w:val="Heading2"/>
       </w:pPr>
-      <w:bookmarkStart w:id="18" w:name="_Toc242269265"/>
+      <w:bookmarkStart w:id="18" w:name="_Toc243095591"/>
       <w:r>
         <w:rPr>
           <w:color w:val="1E3A8A"/>
@@ -10880,7 +11009,7 @@
       <w:pPr>
         <w:pStyle w:val="Heading2"/>
       </w:pPr>
-      <w:bookmarkStart w:id="19" w:name="_Toc242269266"/>
+      <w:bookmarkStart w:id="19" w:name="_Toc243095592"/>
       <w:r>
         <w:rPr>
           <w:color w:val="1E3A8A"/>
@@ -10905,7 +11034,7 @@
       <w:pPr>
         <w:pStyle w:val="Heading2"/>
       </w:pPr>
-      <w:bookmarkStart w:id="20" w:name="_Toc242269267"/>
+      <w:bookmarkStart w:id="20" w:name="_Toc243095593"/>
       <w:r>
         <w:rPr>
           <w:color w:val="1E3A8A"/>
@@ -11405,7 +11534,7 @@
       <w:pPr>
         <w:pStyle w:val="Heading1"/>
       </w:pPr>
-      <w:bookmarkStart w:id="21" w:name="_Toc242269268"/>
+      <w:bookmarkStart w:id="21" w:name="_Toc243095594"/>
       <w:r>
         <w:rPr>
           <w:color w:val="1E3A8A"/>
@@ -11419,7 +11548,7 @@
       <w:pPr>
         <w:pStyle w:val="Heading2"/>
       </w:pPr>
-      <w:bookmarkStart w:id="22" w:name="_Toc242269269"/>
+      <w:bookmarkStart w:id="22" w:name="_Toc243095595"/>
       <w:r>
         <w:rPr>
           <w:color w:val="1E3A8A"/>
@@ -11786,7 +11915,7 @@
       <w:pPr>
         <w:pStyle w:val="Heading2"/>
       </w:pPr>
-      <w:bookmarkStart w:id="23" w:name="_Toc242269270"/>
+      <w:bookmarkStart w:id="23" w:name="_Toc243095596"/>
       <w:r>
         <w:rPr>
           <w:color w:val="1E3A8A"/>
@@ -11851,7 +11980,7 @@
       <w:pPr>
         <w:pStyle w:val="Heading2"/>
       </w:pPr>
-      <w:bookmarkStart w:id="24" w:name="_Toc242269271"/>
+      <w:bookmarkStart w:id="24" w:name="_Toc243095597"/>
       <w:r>
         <w:rPr>
           <w:color w:val="1E3A8A"/>
@@ -12034,7 +12163,7 @@
       <w:pPr>
         <w:pStyle w:val="Heading2"/>
       </w:pPr>
-      <w:bookmarkStart w:id="25" w:name="_Toc242269272"/>
+      <w:bookmarkStart w:id="25" w:name="_Toc243095598"/>
       <w:r>
         <w:rPr>
           <w:color w:val="1E3A8A"/>
@@ -12959,7 +13088,7 @@
       <w:pPr>
         <w:pStyle w:val="Heading2"/>
       </w:pPr>
-      <w:bookmarkStart w:id="26" w:name="_Toc242269273"/>
+      <w:bookmarkStart w:id="26" w:name="_Toc243095599"/>
       <w:r>
         <w:rPr>
           <w:color w:val="1E3A8A"/>
@@ -12984,7 +13113,7 @@
       <w:pPr>
         <w:pStyle w:val="Heading2"/>
       </w:pPr>
-      <w:bookmarkStart w:id="27" w:name="_Toc242269274"/>
+      <w:bookmarkStart w:id="27" w:name="_Toc243095600"/>
       <w:r>
         <w:rPr>
           <w:color w:val="1E3A8A"/>
@@ -13036,7 +13165,7 @@
       <w:pPr>
         <w:pStyle w:val="Heading2"/>
       </w:pPr>
-      <w:bookmarkStart w:id="28" w:name="_Toc242269275"/>
+      <w:bookmarkStart w:id="28" w:name="_Toc243095601"/>
       <w:r>
         <w:rPr>
           <w:color w:val="1E3A8A"/>
@@ -13061,72 +13190,33 @@
       <w:pPr>
         <w:pStyle w:val="Heading2"/>
       </w:pPr>
-      <w:bookmarkStart w:id="29" w:name="_Toc242269276"/>
+      <w:bookmarkStart w:id="29" w:name="_Toc243095602"/>
       <w:r>
         <w:rPr>
           <w:color w:val="1E3A8A"/>
         </w:rPr>
-        <w:t>5.8 PKI, secrets and dxpsctl</w:t>
+        <w:t>5.8 DxPS console</w:t>
       </w:r>
       <w:bookmarkEnd w:id="29"/>
     </w:p>
     <w:p>
       <w:pPr>
-        <w:pStyle w:val="ListBullet"/>
-        <w:spacing w:after="20"/>
+        <w:spacing w:after="80"/>
       </w:pPr>
       <w:r>
         <w:rPr>
           <w:rFonts w:eastAsia="Calibri"/>
           <w:sz w:val="21"/>
         </w:rPr>
-        <w:t>dxpsctl secrets generates database passwords, the JWT key and the secret-box key into secrets.env (mode 0600) in the runtime directory.</w:t>
+        <w:t xml:space="preserve">The console is the signed-in tool for operating and configuring DxPS across all tenants. It has two parts: the console API (Go, https://localhost:8446, loopback only) and the web UI (Next.js, https://localhost:8092). The UI server forwards every call to the API; the session token travels in an HttpOnly, SameSite=Strict cookie that page scripts cannot read, and every change must carry a CSRF header. Users have one or more of four roles: viewer, operator (orders, faults, DLQ redrive, load runs), configurator </w:t>
       </w:r>
-    </w:p>
-    <w:p>
-      <w:pPr>
-        <w:pStyle w:val="ListBullet"/>
-        <w:spacing w:after="20"/>
-      </w:pPr>
       <w:r>
         <w:rPr>
           <w:rFonts w:eastAsia="Calibri"/>
           <w:sz w:val="21"/>
         </w:rPr>
-        <w:t>dxpsctl certs creates the development CA and ECDSA P-256 certificates for PostgreSQL, the gateway, the services and every simulator.</w:t>
+        <w:t>(tenants, NE inventory, catalog drafts, Template Lab) and admin (users).</w:t>
       </w:r>
-    </w:p>
-    <w:p>
-      <w:pPr>
-        <w:pStyle w:val="ListBullet"/>
-        <w:spacing w:after="20"/>
-      </w:pPr>
-      <w:r>
-        <w:rPr>
-          <w:rFonts w:eastAsia="Calibri"/>
-          <w:sz w:val="21"/>
-        </w:rPr>
-        <w:t>dxpsctl migrate / seed / topics prepare PostgreSQL and Kafka; dxpsctl api and trace give read access without handling passwords.</w:t>
-      </w:r>
-    </w:p>
-    <w:p>
-      <w:r>
-        <w:br w:type="page"/>
-      </w:r>
-    </w:p>
-    <w:p>
-      <w:pPr>
-        <w:pStyle w:val="Heading1"/>
-      </w:pPr>
-      <w:bookmarkStart w:id="30" w:name="_Toc242269277"/>
-      <w:r>
-        <w:rPr>
-          <w:color w:val="1E3A8A"/>
-        </w:rPr>
-        <w:lastRenderedPageBreak/>
-        <w:t>6. What happens when something fails</w:t>
-      </w:r>
-      <w:bookmarkEnd w:id="30"/>
     </w:p>
     <w:tbl>
       <w:tblPr>
@@ -13157,6 +13247,577 @@
                 <w:color w:val="FFFFFF"/>
                 <w:sz w:val="15"/>
               </w:rPr>
+              <w:t>Data</w:t>
+            </w:r>
+          </w:p>
+        </w:tc>
+        <w:tc>
+          <w:tcPr>
+            <w:tcW w:w="3168" w:type="dxa"/>
+            <w:shd w:val="clear" w:color="auto" w:fill="1E3A8A"/>
+          </w:tcPr>
+          <w:p>
+            <w:r>
+              <w:rPr>
+                <w:rFonts w:eastAsia="Calibri"/>
+                <w:b/>
+                <w:color w:val="FFFFFF"/>
+                <w:sz w:val="15"/>
+              </w:rPr>
+              <w:t>Where</w:t>
+            </w:r>
+          </w:p>
+        </w:tc>
+        <w:tc>
+          <w:tcPr>
+            <w:tcW w:w="4032" w:type="dxa"/>
+            <w:shd w:val="clear" w:color="auto" w:fill="1E3A8A"/>
+          </w:tcPr>
+          <w:p>
+            <w:r>
+              <w:rPr>
+                <w:rFonts w:eastAsia="Calibri"/>
+                <w:b/>
+                <w:color w:val="FFFFFF"/>
+                <w:sz w:val="15"/>
+              </w:rPr>
+              <w:t>How the console uses it</w:t>
+            </w:r>
+          </w:p>
+        </w:tc>
+      </w:tr>
+      <w:tr>
+        <w:trPr>
+          <w:jc w:val="center"/>
+        </w:trPr>
+        <w:tc>
+          <w:tcPr>
+            <w:tcW w:w="3024" w:type="dxa"/>
+          </w:tcPr>
+          <w:p>
+            <w:r>
+              <w:rPr>
+                <w:rFonts w:eastAsia="Calibri"/>
+                <w:sz w:val="15"/>
+              </w:rPr>
+              <w:t>Orders, tasks, attempts, NE inventory, audit</w:t>
+            </w:r>
+          </w:p>
+        </w:tc>
+        <w:tc>
+          <w:tcPr>
+            <w:tcW w:w="3168" w:type="dxa"/>
+          </w:tcPr>
+          <w:p>
+            <w:r>
+              <w:rPr>
+                <w:rFonts w:eastAsia="Calibri"/>
+                <w:sz w:val="15"/>
+              </w:rPr>
+              <w:t>PostgreSQL, as dxps_ops</w:t>
+            </w:r>
+          </w:p>
+        </w:tc>
+        <w:tc>
+          <w:tcPr>
+            <w:tcW w:w="4032" w:type="dxa"/>
+          </w:tcPr>
+          <w:p>
+            <w:r>
+              <w:rPr>
+                <w:rFonts w:eastAsia="Calibri"/>
+                <w:sz w:val="15"/>
+              </w:rPr>
+              <w:t>Reads across all tenants: lists, order detail with the task graph and the NE request and response of every attempt, reports</w:t>
+            </w:r>
+          </w:p>
+        </w:tc>
+      </w:tr>
+      <w:tr>
+        <w:trPr>
+          <w:jc w:val="center"/>
+        </w:trPr>
+        <w:tc>
+          <w:tcPr>
+            <w:tcW w:w="3024" w:type="dxa"/>
+            <w:shd w:val="clear" w:color="auto" w:fill="F1F5F9"/>
+          </w:tcPr>
+          <w:p>
+            <w:r>
+              <w:rPr>
+                <w:rFonts w:eastAsia="Calibri"/>
+                <w:sz w:val="15"/>
+              </w:rPr>
+              <w:t>tenant, network_element, tenant_ne_access</w:t>
+            </w:r>
+          </w:p>
+        </w:tc>
+        <w:tc>
+          <w:tcPr>
+            <w:tcW w:w="3168" w:type="dxa"/>
+            <w:shd w:val="clear" w:color="auto" w:fill="F1F5F9"/>
+          </w:tcPr>
+          <w:p>
+            <w:r>
+              <w:rPr>
+                <w:rFonts w:eastAsia="Calibri"/>
+                <w:sz w:val="15"/>
+              </w:rPr>
+              <w:t>PostgreSQL, as dxps_ops</w:t>
+            </w:r>
+          </w:p>
+        </w:tc>
+        <w:tc>
+          <w:tcPr>
+            <w:tcW w:w="4032" w:type="dxa"/>
+            <w:shd w:val="clear" w:color="auto" w:fill="F1F5F9"/>
+          </w:tcPr>
+          <w:p>
+            <w:r>
+              <w:rPr>
+                <w:rFonts w:eastAsia="Calibri"/>
+                <w:sz w:val="15"/>
+              </w:rPr>
+              <w:t>Updates tenant SLA tier, weight, quota and status, NE limits, and entitlements; each change writes an audit_event row with actor console:&lt;user&gt; and the before and after values</w:t>
+            </w:r>
+          </w:p>
+        </w:tc>
+      </w:tr>
+      <w:tr>
+        <w:trPr>
+          <w:jc w:val="center"/>
+        </w:trPr>
+        <w:tc>
+          <w:tcPr>
+            <w:tcW w:w="3024" w:type="dxa"/>
+          </w:tcPr>
+          <w:p>
+            <w:r>
+              <w:rPr>
+                <w:rFonts w:eastAsia="Calibri"/>
+                <w:sz w:val="15"/>
+              </w:rPr>
+              <w:t>Topics and consumer groups</w:t>
+            </w:r>
+          </w:p>
+        </w:tc>
+        <w:tc>
+          <w:tcPr>
+            <w:tcW w:w="3168" w:type="dxa"/>
+          </w:tcPr>
+          <w:p>
+            <w:r>
+              <w:rPr>
+                <w:rFonts w:eastAsia="Calibri"/>
+                <w:sz w:val="15"/>
+              </w:rPr>
+              <w:t>Kafka</w:t>
+            </w:r>
+          </w:p>
+        </w:tc>
+        <w:tc>
+          <w:tcPr>
+            <w:tcW w:w="4032" w:type="dxa"/>
+          </w:tcPr>
+          <w:p>
+            <w:r>
+              <w:rPr>
+                <w:rFonts w:eastAsia="Calibri"/>
+                <w:sz w:val="15"/>
+              </w:rPr>
+              <w:t>End offsets and group lag; dead letters are read from dxps.dlq and redriven to their original topic</w:t>
+            </w:r>
+          </w:p>
+        </w:tc>
+      </w:tr>
+      <w:tr>
+        <w:trPr>
+          <w:jc w:val="center"/>
+        </w:trPr>
+        <w:tc>
+          <w:tcPr>
+            <w:tcW w:w="3024" w:type="dxa"/>
+            <w:shd w:val="clear" w:color="auto" w:fill="F1F5F9"/>
+          </w:tcPr>
+          <w:p>
+            <w:r>
+              <w:rPr>
+                <w:rFonts w:eastAsia="Calibri"/>
+                <w:sz w:val="15"/>
+              </w:rPr>
+              <w:t>Service statistics</w:t>
+            </w:r>
+          </w:p>
+        </w:tc>
+        <w:tc>
+          <w:tcPr>
+            <w:tcW w:w="3168" w:type="dxa"/>
+            <w:shd w:val="clear" w:color="auto" w:fill="F1F5F9"/>
+          </w:tcPr>
+          <w:p>
+            <w:r>
+              <w:rPr>
+                <w:rFonts w:eastAsia="Calibri"/>
+                <w:sz w:val="15"/>
+              </w:rPr>
+              <w:t>Stats ports 9201-9203, Mosaic 8088, netsim admin 9199</w:t>
+            </w:r>
+          </w:p>
+        </w:tc>
+        <w:tc>
+          <w:tcPr>
+            <w:tcW w:w="4032" w:type="dxa"/>
+            <w:shd w:val="clear" w:color="auto" w:fill="F1F5F9"/>
+          </w:tcPr>
+          <w:p>
+            <w:r>
+              <w:rPr>
+                <w:rFonts w:eastAsia="Calibri"/>
+                <w:sz w:val="15"/>
+              </w:rPr>
+              <w:t>Health, live rates, simulator latency and fault settings</w:t>
+            </w:r>
+          </w:p>
+        </w:tc>
+      </w:tr>
+      <w:tr>
+        <w:trPr>
+          <w:jc w:val="center"/>
+        </w:trPr>
+        <w:tc>
+          <w:tcPr>
+            <w:tcW w:w="3024" w:type="dxa"/>
+          </w:tcPr>
+          <w:p>
+            <w:r>
+              <w:rPr>
+                <w:rFonts w:eastAsia="Calibri"/>
+                <w:sz w:val="15"/>
+              </w:rPr>
+              <w:t>New orders</w:t>
+            </w:r>
+          </w:p>
+        </w:tc>
+        <w:tc>
+          <w:tcPr>
+            <w:tcW w:w="3168" w:type="dxa"/>
+          </w:tcPr>
+          <w:p>
+            <w:r>
+              <w:rPr>
+                <w:rFonts w:eastAsia="Calibri"/>
+                <w:sz w:val="15"/>
+              </w:rPr>
+              <w:t>Gateway 8443</w:t>
+            </w:r>
+          </w:p>
+        </w:tc>
+        <w:tc>
+          <w:tcPr>
+            <w:tcW w:w="4032" w:type="dxa"/>
+          </w:tcPr>
+          <w:p>
+            <w:r>
+              <w:rPr>
+                <w:rFonts w:eastAsia="Calibri"/>
+                <w:sz w:val="15"/>
+              </w:rPr>
+              <w:t>Submitted and cancelled through the TMF641 API with a 2-minute tenant token limited to order read and write</w:t>
+            </w:r>
+          </w:p>
+        </w:tc>
+      </w:tr>
+      <w:tr>
+        <w:trPr>
+          <w:jc w:val="center"/>
+        </w:trPr>
+        <w:tc>
+          <w:tcPr>
+            <w:tcW w:w="3024" w:type="dxa"/>
+            <w:shd w:val="clear" w:color="auto" w:fill="F1F5F9"/>
+          </w:tcPr>
+          <w:p>
+            <w:r>
+              <w:rPr>
+                <w:rFonts w:eastAsia="Calibri"/>
+                <w:sz w:val="15"/>
+              </w:rPr>
+              <w:t>Console users, drafts, console audit</w:t>
+            </w:r>
+          </w:p>
+        </w:tc>
+        <w:tc>
+          <w:tcPr>
+            <w:tcW w:w="3168" w:type="dxa"/>
+            <w:shd w:val="clear" w:color="auto" w:fill="F1F5F9"/>
+          </w:tcPr>
+          <w:p>
+            <w:r>
+              <w:rPr>
+                <w:rFonts w:eastAsia="Calibri"/>
+                <w:sz w:val="15"/>
+              </w:rPr>
+              <w:t>~/dxps-runtime/console/</w:t>
+            </w:r>
+          </w:p>
+        </w:tc>
+        <w:tc>
+          <w:tcPr>
+            <w:tcW w:w="4032" w:type="dxa"/>
+            <w:shd w:val="clear" w:color="auto" w:fill="F1F5F9"/>
+          </w:tcPr>
+          <w:p>
+            <w:r>
+              <w:rPr>
+                <w:rFonts w:eastAsia="Calibri"/>
+                <w:sz w:val="15"/>
+              </w:rPr>
+              <w:t>users.json (PBKDF2-SHA256 hashes, mode 0600), drafts/ and audit.jsonl</w:t>
+            </w:r>
+          </w:p>
+        </w:tc>
+      </w:tr>
+    </w:tbl>
+    <w:p>
+      <w:pPr>
+        <w:spacing w:after="40"/>
+      </w:pPr>
+    </w:p>
+    <w:p>
+      <w:pPr>
+        <w:spacing w:after="80"/>
+      </w:pPr>
+      <w:r>
+        <w:rPr>
+          <w:rFonts w:eastAsia="Calibri"/>
+          <w:sz w:val="21"/>
+        </w:rPr>
+        <w:lastRenderedPageBreak/>
+        <w:t>Catalog changes use drafts because the services run with the catalog compiled in. A draft holds changed or new spec files. Validate loads the whole catalog with the change and runs the example of every spec through the Template Lab. The Lab runs the real planner and adapter renderers without calling any NE and shows the task graph, the CEL decisions and the exact NE requests. Export produces the files to copy into internal/catalog/data before a rebuild.</w:t>
+      </w:r>
+    </w:p>
+    <w:p>
+      <w:pPr>
+        <w:jc w:val="center"/>
+      </w:pPr>
+      <w:r>
+        <w:rPr>
+          <w:noProof/>
+        </w:rPr>
+        <w:drawing>
+          <wp:inline distT="0" distB="0" distL="0" distR="0" wp14:anchorId="2D893675" wp14:editId="03FAFF00">
+            <wp:extent cx="6035040" cy="4966335"/>
+            <wp:effectExtent l="0" t="0" r="0" b="0"/>
+            <wp:docPr id="4" name="Picture 4"/>
+            <wp:cNvGraphicFramePr>
+              <a:graphicFrameLocks xmlns:a="http://schemas.openxmlformats.org/drawingml/2006/main" noChangeAspect="1"/>
+            </wp:cNvGraphicFramePr>
+            <a:graphic xmlns:a="http://schemas.openxmlformats.org/drawingml/2006/main">
+              <a:graphicData uri="http://schemas.openxmlformats.org/drawingml/2006/picture">
+                <pic:pic xmlns:pic="http://schemas.openxmlformats.org/drawingml/2006/picture">
+                  <pic:nvPicPr>
+                    <pic:cNvPr id="0" name="order-detail.png"/>
+                    <pic:cNvPicPr/>
+                  </pic:nvPicPr>
+                  <pic:blipFill>
+                    <a:blip r:embed="rId11"/>
+                    <a:stretch>
+                      <a:fillRect/>
+                    </a:stretch>
+                  </pic:blipFill>
+                  <pic:spPr>
+                    <a:xfrm>
+                      <a:off x="0" y="0"/>
+                      <a:ext cx="6035040" cy="4966335"/>
+                    </a:xfrm>
+                    <a:prstGeom prst="rect">
+                      <a:avLst/>
+                    </a:prstGeom>
+                  </pic:spPr>
+                </pic:pic>
+              </a:graphicData>
+            </a:graphic>
+          </wp:inline>
+        </w:drawing>
+      </w:r>
+    </w:p>
+    <w:p>
+      <w:pPr>
+        <w:spacing w:after="80"/>
+        <w:jc w:val="center"/>
+      </w:pPr>
+      <w:r>
+        <w:rPr>
+          <w:rFonts w:eastAsia="Calibri"/>
+          <w:i/>
+          <w:color w:val="4B5563"/>
+          <w:sz w:val="17"/>
+        </w:rPr>
+        <w:t>Figure: Console: order detail with the task graph and NE exchange</w:t>
+      </w:r>
+    </w:p>
+    <w:p>
+      <w:pPr>
+        <w:jc w:val="center"/>
+      </w:pPr>
+      <w:r>
+        <w:rPr>
+          <w:noProof/>
+        </w:rPr>
+        <w:lastRenderedPageBreak/>
+        <w:drawing>
+          <wp:inline distT="0" distB="0" distL="0" distR="0" wp14:anchorId="4F1543F8" wp14:editId="7DDD57EF">
+            <wp:extent cx="6035040" cy="7895844"/>
+            <wp:effectExtent l="0" t="0" r="0" b="0"/>
+            <wp:docPr id="5" name="Picture 5"/>
+            <wp:cNvGraphicFramePr>
+              <a:graphicFrameLocks xmlns:a="http://schemas.openxmlformats.org/drawingml/2006/main" noChangeAspect="1"/>
+            </wp:cNvGraphicFramePr>
+            <a:graphic xmlns:a="http://schemas.openxmlformats.org/drawingml/2006/main">
+              <a:graphicData uri="http://schemas.openxmlformats.org/drawingml/2006/picture">
+                <pic:pic xmlns:pic="http://schemas.openxmlformats.org/drawingml/2006/picture">
+                  <pic:nvPicPr>
+                    <pic:cNvPr id="0" name="template-lab.png"/>
+                    <pic:cNvPicPr/>
+                  </pic:nvPicPr>
+                  <pic:blipFill>
+                    <a:blip r:embed="rId12"/>
+                    <a:stretch>
+                      <a:fillRect/>
+                    </a:stretch>
+                  </pic:blipFill>
+                  <pic:spPr>
+                    <a:xfrm>
+                      <a:off x="0" y="0"/>
+                      <a:ext cx="6035040" cy="7895844"/>
+                    </a:xfrm>
+                    <a:prstGeom prst="rect">
+                      <a:avLst/>
+                    </a:prstGeom>
+                  </pic:spPr>
+                </pic:pic>
+              </a:graphicData>
+            </a:graphic>
+          </wp:inline>
+        </w:drawing>
+      </w:r>
+    </w:p>
+    <w:p>
+      <w:pPr>
+        <w:spacing w:after="80"/>
+        <w:jc w:val="center"/>
+      </w:pPr>
+      <w:r>
+        <w:rPr>
+          <w:rFonts w:eastAsia="Calibri"/>
+          <w:i/>
+          <w:color w:val="4B5563"/>
+          <w:sz w:val="17"/>
+        </w:rPr>
+        <w:t>Figure: Console: Template Lab dry run</w:t>
+      </w:r>
+    </w:p>
+    <w:p>
+      <w:pPr>
+        <w:pStyle w:val="Heading2"/>
+      </w:pPr>
+      <w:bookmarkStart w:id="30" w:name="_Toc243095603"/>
+      <w:r>
+        <w:rPr>
+          <w:color w:val="1E3A8A"/>
+        </w:rPr>
+        <w:lastRenderedPageBreak/>
+        <w:t>5.9 PKI, secrets and dxpsctl</w:t>
+      </w:r>
+      <w:bookmarkEnd w:id="30"/>
+    </w:p>
+    <w:p>
+      <w:pPr>
+        <w:pStyle w:val="ListBullet"/>
+        <w:spacing w:after="20"/>
+      </w:pPr>
+      <w:r>
+        <w:rPr>
+          <w:rFonts w:eastAsia="Calibri"/>
+          <w:sz w:val="21"/>
+        </w:rPr>
+        <w:t>dxpsctl secrets generates database passwords, the JWT key and the secret-box key into secrets.env (mode 0600) in the runtime directory.</w:t>
+      </w:r>
+    </w:p>
+    <w:p>
+      <w:pPr>
+        <w:pStyle w:val="ListBullet"/>
+        <w:spacing w:after="20"/>
+      </w:pPr>
+      <w:r>
+        <w:rPr>
+          <w:rFonts w:eastAsia="Calibri"/>
+          <w:sz w:val="21"/>
+        </w:rPr>
+        <w:t>dxpsctl certs creates the development CA and ECDSA P-256 certificates for PostgreSQL, the gateway, the services and every simulator.</w:t>
+      </w:r>
+    </w:p>
+    <w:p>
+      <w:pPr>
+        <w:pStyle w:val="ListBullet"/>
+        <w:spacing w:after="20"/>
+      </w:pPr>
+      <w:r>
+        <w:rPr>
+          <w:rFonts w:eastAsia="Calibri"/>
+          <w:sz w:val="21"/>
+        </w:rPr>
+        <w:t>dxpsctl migrate / seed / topics prepare PostgreSQL and Kafka; dxpsctl api and trace give read access without handling passwords.</w:t>
+      </w:r>
+    </w:p>
+    <w:p>
+      <w:r>
+        <w:br w:type="page"/>
+      </w:r>
+    </w:p>
+    <w:p>
+      <w:pPr>
+        <w:pStyle w:val="Heading1"/>
+      </w:pPr>
+      <w:bookmarkStart w:id="31" w:name="_Toc243095604"/>
+      <w:r>
+        <w:rPr>
+          <w:color w:val="1E3A8A"/>
+        </w:rPr>
+        <w:lastRenderedPageBreak/>
+        <w:t>6. What happens when something fails</w:t>
+      </w:r>
+      <w:bookmarkEnd w:id="31"/>
+    </w:p>
+    <w:tbl>
+      <w:tblPr>
+        <w:tblStyle w:val="TableGrid"/>
+        <w:tblW w:w="0" w:type="auto"/>
+        <w:jc w:val="center"/>
+        <w:tblLook w:val="04A0" w:firstRow="1" w:lastRow="0" w:firstColumn="1" w:lastColumn="0" w:noHBand="0" w:noVBand="1"/>
+      </w:tblPr>
+      <w:tblGrid>
+        <w:gridCol w:w="3024"/>
+        <w:gridCol w:w="3168"/>
+        <w:gridCol w:w="4032"/>
+      </w:tblGrid>
+      <w:tr>
+        <w:trPr>
+          <w:jc w:val="center"/>
+        </w:trPr>
+        <w:tc>
+          <w:tcPr>
+            <w:tcW w:w="3024" w:type="dxa"/>
+            <w:shd w:val="clear" w:color="auto" w:fill="1E3A8A"/>
+          </w:tcPr>
+          <w:p>
+            <w:r>
+              <w:rPr>
+                <w:rFonts w:eastAsia="Calibri"/>
+                <w:b/>
+                <w:color w:val="FFFFFF"/>
+                <w:sz w:val="15"/>
+              </w:rPr>
               <w:t>Situation</w:t>
             </w:r>
           </w:p>
@@ -13688,8 +14349,8 @@
       </w:pPr>
     </w:p>
     <w:sectPr>
-      <w:headerReference w:type="default" r:id="rId11"/>
-      <w:footerReference w:type="default" r:id="rId12"/>
+      <w:headerReference w:type="default" r:id="rId13"/>
+      <w:footerReference w:type="default" r:id="rId14"/>
       <w:pgSz w:w="12240" w:h="15840"/>
       <w:pgMar w:top="1080" w:right="1008" w:bottom="1080" w:left="1008" w:header="720" w:footer="720" w:gutter="0"/>
       <w:cols w:space="720"/>
@@ -13700,7 +14361,7 @@
 </file>
 
 <file path=word/endnotes.xml><?xml version="1.0" encoding="utf-8"?>
-<w:endnotes xmlns:wpc="http://schemas.microsoft.com/office/word/2010/wordprocessingCanvas" xmlns:cx="http://schemas.microsoft.com/office/drawing/2014/chartex" xmlns:cx1="http://schemas.microsoft.com/office/drawing/2015/9/8/chartex" xmlns:cx2="http://schemas.microsoft.com/office/drawing/2015/10/21/chartex" xmlns:cx3="http://schemas.microsoft.com/office/drawing/2016/5/9/chartex" xmlns:cx4="http://schemas.microsoft.com/office/drawing/2016/5/10/chartex" xmlns:cx5="http://schemas.microsoft.com/office/drawing/2016/5/11/chartex" xmlns:cx6="http://schemas.microsoft.com/office/drawing/2016/5/12/chartex" xmlns:cx7="http://schemas.microsoft.com/office/drawing/2016/5/13/chartex" xmlns:cx8="http://schemas.microsoft.com/office/drawing/2016/5/14/chartex" xmlns:mc="http://schemas.openxmlformats.org/markup-compatibility/2006" xmlns:aink="http://schemas.microsoft.com/office/drawing/2016/ink" xmlns:am3d="http://schemas.microsoft.com/office/drawing/2017/model3d" xmlns:o="urn:schemas-microsoft-com:office:office" xmlns:oel="http://schemas.microsoft.com/office/2019/extlst" xmlns:r="http://schemas.openxmlformats.org/officeDocument/2006/relationships" xmlns:m="http://schemas.openxmlformats.org/officeDocument/2006/math" xmlns:v="urn:schemas-microsoft-com:vml" xmlns:wp14="http://schemas.microsoft.com/office/word/2010/wordprocessingDrawing" xmlns:wp="http://schemas.openxmlformats.org/drawingml/2006/wordprocessingDrawing" xmlns:w10="urn:schemas-microsoft-com:office:word" xmlns:w="http://schemas.openxmlformats.org/wordprocessingml/2006/main" xmlns:w14="http://schemas.microsoft.com/office/word/2010/wordml" xmlns:w15="http://schemas.microsoft.com/office/word/2012/wordml" xmlns:w16cex="http://schemas.microsoft.com/office/word/2018/wordml/cex" xmlns:w16cid="http://schemas.microsoft.com/office/word/2016/wordml/cid" xmlns:w16="http://schemas.microsoft.com/office/word/2018/wordml" xmlns:w16du="http://schemas.microsoft.com/office/word/2023/wordml/word16du" xmlns:w16sdtdh="http://schemas.microsoft.com/office/word/2020/wordml/sdtdatahash" xmlns:w16sdtfl="http://schemas.microsoft.com/office/word/2024/wordml/sdtformatlock" xmlns:w16se="http://schemas.microsoft.com/office/word/2015/wordml/symex" xmlns:wpg="http://schemas.microsoft.com/office/word/2010/wordprocessingGroup" xmlns:wpi="http://schemas.microsoft.com/office/word/2010/wordprocessingInk" xmlns:wne="http://schemas.microsoft.com/office/word/2006/wordml" xmlns:wps="http://schemas.microsoft.com/office/word/2010/wordprocessingShape" mc:Ignorable="w14 w15 w16se w16cid w16 w16cex w16sdtdh w16sdtfl w16du wp14">
+<w:endnotes xmlns:wpc="http://schemas.microsoft.com/office/word/2010/wordprocessingCanvas" xmlns:cx="http://schemas.microsoft.com/office/drawing/2014/chartex" xmlns:cx1="http://schemas.microsoft.com/office/drawing/2015/9/8/chartex" xmlns:cx2="http://schemas.microsoft.com/office/drawing/2015/10/21/chartex" xmlns:cx3="http://schemas.microsoft.com/office/drawing/2016/5/9/chartex" xmlns:cx4="http://schemas.microsoft.com/office/drawing/2016/5/10/chartex" xmlns:cx5="http://schemas.microsoft.com/office/drawing/2016/5/11/chartex" xmlns:cx6="http://schemas.microsoft.com/office/drawing/2016/5/12/chartex" xmlns:cx7="http://schemas.microsoft.com/office/drawing/2016/5/13/chartex" xmlns:cx8="http://schemas.microsoft.com/office/drawing/2016/5/14/chartex" xmlns:mc="http://schemas.openxmlformats.org/markup-compatibility/2006" xmlns:m="http://schemas.openxmlformats.org/officeDocument/2006/math" xmlns:aink="http://schemas.microsoft.com/office/drawing/2016/ink" xmlns:am3d="http://schemas.microsoft.com/office/drawing/2017/model3d" xmlns:oel="http://schemas.microsoft.com/office/2019/extlst" xmlns:r="http://schemas.openxmlformats.org/officeDocument/2006/relationships" xmlns:wp14="http://schemas.microsoft.com/office/word/2010/wordprocessingDrawing" xmlns:wp="http://schemas.openxmlformats.org/drawingml/2006/wordprocessingDrawing" xmlns:wpg="http://schemas.microsoft.com/office/word/2010/wordprocessingGroup" xmlns:wpi="http://schemas.microsoft.com/office/word/2010/wordprocessingInk" xmlns:wps="http://schemas.microsoft.com/office/word/2010/wordprocessingShape" xmlns:o="urn:schemas-microsoft-com:office:office" xmlns:v="urn:schemas-microsoft-com:vml" xmlns:w10="urn:schemas-microsoft-com:office:word" xmlns:w="http://schemas.openxmlformats.org/wordprocessingml/2006/main" xmlns:w14="http://schemas.microsoft.com/office/word/2010/wordml" xmlns:w15="http://schemas.microsoft.com/office/word/2012/wordml" xmlns:w16cex="http://schemas.microsoft.com/office/word/2018/wordml/cex" xmlns:w16cid="http://schemas.microsoft.com/office/word/2016/wordml/cid" xmlns:w16="http://schemas.microsoft.com/office/word/2018/wordml" xmlns:w16sdtdh="http://schemas.microsoft.com/office/word/2020/wordml/sdtdatahash" xmlns:w16sdtfl="http://schemas.microsoft.com/office/word/2024/wordml/sdtformatlock" xmlns:w16se="http://schemas.microsoft.com/office/word/2015/wordml/symex" xmlns:w16du="http://schemas.microsoft.com/office/word/2023/wordml/word16du" xmlns:wne="http://schemas.microsoft.com/office/word/2006/wordml" mc:Ignorable="w14 w15 w16se w16cid w16 w16cex w16sdtdh w16sdtfl w16du wp14">
   <w:endnote w:type="separator" w:id="-1">
     <w:p>
       <w:pPr>
@@ -13725,7 +14386,7 @@
 </file>
 
 <file path=word/footer1.xml><?xml version="1.0" encoding="utf-8"?>
-<w:ftr xmlns:wpc="http://schemas.microsoft.com/office/word/2010/wordprocessingCanvas" xmlns:cx="http://schemas.microsoft.com/office/drawing/2014/chartex" xmlns:cx1="http://schemas.microsoft.com/office/drawing/2015/9/8/chartex" xmlns:cx2="http://schemas.microsoft.com/office/drawing/2015/10/21/chartex" xmlns:cx3="http://schemas.microsoft.com/office/drawing/2016/5/9/chartex" xmlns:cx4="http://schemas.microsoft.com/office/drawing/2016/5/10/chartex" xmlns:cx5="http://schemas.microsoft.com/office/drawing/2016/5/11/chartex" xmlns:cx6="http://schemas.microsoft.com/office/drawing/2016/5/12/chartex" xmlns:cx7="http://schemas.microsoft.com/office/drawing/2016/5/13/chartex" xmlns:cx8="http://schemas.microsoft.com/office/drawing/2016/5/14/chartex" xmlns:mc="http://schemas.openxmlformats.org/markup-compatibility/2006" xmlns:aink="http://schemas.microsoft.com/office/drawing/2016/ink" xmlns:am3d="http://schemas.microsoft.com/office/drawing/2017/model3d" xmlns:o="urn:schemas-microsoft-com:office:office" xmlns:oel="http://schemas.microsoft.com/office/2019/extlst" xmlns:r="http://schemas.openxmlformats.org/officeDocument/2006/relationships" xmlns:m="http://schemas.openxmlformats.org/officeDocument/2006/math" xmlns:v="urn:schemas-microsoft-com:vml" xmlns:wp14="http://schemas.microsoft.com/office/word/2010/wordprocessingDrawing" xmlns:wp="http://schemas.openxmlformats.org/drawingml/2006/wordprocessingDrawing" xmlns:w10="urn:schemas-microsoft-com:office:word" xmlns:w="http://schemas.openxmlformats.org/wordprocessingml/2006/main" xmlns:w14="http://schemas.microsoft.com/office/word/2010/wordml" xmlns:w15="http://schemas.microsoft.com/office/word/2012/wordml" xmlns:w16cex="http://schemas.microsoft.com/office/word/2018/wordml/cex" xmlns:w16cid="http://schemas.microsoft.com/office/word/2016/wordml/cid" xmlns:w16="http://schemas.microsoft.com/office/word/2018/wordml" xmlns:w16du="http://schemas.microsoft.com/office/word/2023/wordml/word16du" xmlns:w16sdtdh="http://schemas.microsoft.com/office/word/2020/wordml/sdtdatahash" xmlns:w16sdtfl="http://schemas.microsoft.com/office/word/2024/wordml/sdtformatlock" xmlns:w16se="http://schemas.microsoft.com/office/word/2015/wordml/symex" xmlns:wpg="http://schemas.microsoft.com/office/word/2010/wordprocessingGroup" xmlns:wpi="http://schemas.microsoft.com/office/word/2010/wordprocessingInk" xmlns:wne="http://schemas.microsoft.com/office/word/2006/wordml" xmlns:wps="http://schemas.microsoft.com/office/word/2010/wordprocessingShape" mc:Ignorable="w14 w15 w16se w16cid w16 w16cex w16sdtdh w16sdtfl w16du wp14">
+<w:ftr xmlns:wpc="http://schemas.microsoft.com/office/word/2010/wordprocessingCanvas" xmlns:cx="http://schemas.microsoft.com/office/drawing/2014/chartex" xmlns:cx1="http://schemas.microsoft.com/office/drawing/2015/9/8/chartex" xmlns:cx2="http://schemas.microsoft.com/office/drawing/2015/10/21/chartex" xmlns:cx3="http://schemas.microsoft.com/office/drawing/2016/5/9/chartex" xmlns:cx4="http://schemas.microsoft.com/office/drawing/2016/5/10/chartex" xmlns:cx5="http://schemas.microsoft.com/office/drawing/2016/5/11/chartex" xmlns:cx6="http://schemas.microsoft.com/office/drawing/2016/5/12/chartex" xmlns:cx7="http://schemas.microsoft.com/office/drawing/2016/5/13/chartex" xmlns:cx8="http://schemas.microsoft.com/office/drawing/2016/5/14/chartex" xmlns:mc="http://schemas.openxmlformats.org/markup-compatibility/2006" xmlns:m="http://schemas.openxmlformats.org/officeDocument/2006/math" xmlns:aink="http://schemas.microsoft.com/office/drawing/2016/ink" xmlns:am3d="http://schemas.microsoft.com/office/drawing/2017/model3d" xmlns:oel="http://schemas.microsoft.com/office/2019/extlst" xmlns:r="http://schemas.openxmlformats.org/officeDocument/2006/relationships" xmlns:wp14="http://schemas.microsoft.com/office/word/2010/wordprocessingDrawing" xmlns:wp="http://schemas.openxmlformats.org/drawingml/2006/wordprocessingDrawing" xmlns:wpg="http://schemas.microsoft.com/office/word/2010/wordprocessingGroup" xmlns:wpi="http://schemas.microsoft.com/office/word/2010/wordprocessingInk" xmlns:wps="http://schemas.microsoft.com/office/word/2010/wordprocessingShape" xmlns:o="urn:schemas-microsoft-com:office:office" xmlns:v="urn:schemas-microsoft-com:vml" xmlns:w10="urn:schemas-microsoft-com:office:word" xmlns:w="http://schemas.openxmlformats.org/wordprocessingml/2006/main" xmlns:w14="http://schemas.microsoft.com/office/word/2010/wordml" xmlns:w15="http://schemas.microsoft.com/office/word/2012/wordml" xmlns:w16cex="http://schemas.microsoft.com/office/word/2018/wordml/cex" xmlns:w16cid="http://schemas.microsoft.com/office/word/2016/wordml/cid" xmlns:w16="http://schemas.microsoft.com/office/word/2018/wordml" xmlns:w16sdtdh="http://schemas.microsoft.com/office/word/2020/wordml/sdtdatahash" xmlns:w16sdtfl="http://schemas.microsoft.com/office/word/2024/wordml/sdtformatlock" xmlns:w16se="http://schemas.microsoft.com/office/word/2015/wordml/symex" xmlns:w16du="http://schemas.microsoft.com/office/word/2023/wordml/word16du" xmlns:wne="http://schemas.microsoft.com/office/word/2006/wordml" mc:Ignorable="w14 w15 w16se w16cid w16 w16cex w16sdtdh w16sdtfl w16du wp14">
   <w:p>
     <w:pPr>
       <w:pStyle w:val="Footer"/>
@@ -13777,7 +14438,7 @@
 </file>
 
 <file path=word/footnotes.xml><?xml version="1.0" encoding="utf-8"?>
-<w:footnotes xmlns:wpc="http://schemas.microsoft.com/office/word/2010/wordprocessingCanvas" xmlns:cx="http://schemas.microsoft.com/office/drawing/2014/chartex" xmlns:cx1="http://schemas.microsoft.com/office/drawing/2015/9/8/chartex" xmlns:cx2="http://schemas.microsoft.com/office/drawing/2015/10/21/chartex" xmlns:cx3="http://schemas.microsoft.com/office/drawing/2016/5/9/chartex" xmlns:cx4="http://schemas.microsoft.com/office/drawing/2016/5/10/chartex" xmlns:cx5="http://schemas.microsoft.com/office/drawing/2016/5/11/chartex" xmlns:cx6="http://schemas.microsoft.com/office/drawing/2016/5/12/chartex" xmlns:cx7="http://schemas.microsoft.com/office/drawing/2016/5/13/chartex" xmlns:cx8="http://schemas.microsoft.com/office/drawing/2016/5/14/chartex" xmlns:mc="http://schemas.openxmlformats.org/markup-compatibility/2006" xmlns:aink="http://schemas.microsoft.com/office/drawing/2016/ink" xmlns:am3d="http://schemas.microsoft.com/office/drawing/2017/model3d" xmlns:o="urn:schemas-microsoft-com:office:office" xmlns:oel="http://schemas.microsoft.com/office/2019/extlst" xmlns:r="http://schemas.openxmlformats.org/officeDocument/2006/relationships" xmlns:m="http://schemas.openxmlformats.org/officeDocument/2006/math" xmlns:v="urn:schemas-microsoft-com:vml" xmlns:wp14="http://schemas.microsoft.com/office/word/2010/wordprocessingDrawing" xmlns:wp="http://schemas.openxmlformats.org/drawingml/2006/wordprocessingDrawing" xmlns:w10="urn:schemas-microsoft-com:office:word" xmlns:w="http://schemas.openxmlformats.org/wordprocessingml/2006/main" xmlns:w14="http://schemas.microsoft.com/office/word/2010/wordml" xmlns:w15="http://schemas.microsoft.com/office/word/2012/wordml" xmlns:w16cex="http://schemas.microsoft.com/office/word/2018/wordml/cex" xmlns:w16cid="http://schemas.microsoft.com/office/word/2016/wordml/cid" xmlns:w16="http://schemas.microsoft.com/office/word/2018/wordml" xmlns:w16du="http://schemas.microsoft.com/office/word/2023/wordml/word16du" xmlns:w16sdtdh="http://schemas.microsoft.com/office/word/2020/wordml/sdtdatahash" xmlns:w16sdtfl="http://schemas.microsoft.com/office/word/2024/wordml/sdtformatlock" xmlns:w16se="http://schemas.microsoft.com/office/word/2015/wordml/symex" xmlns:wpg="http://schemas.microsoft.com/office/word/2010/wordprocessingGroup" xmlns:wpi="http://schemas.microsoft.com/office/word/2010/wordprocessingInk" xmlns:wne="http://schemas.microsoft.com/office/word/2006/wordml" xmlns:wps="http://schemas.microsoft.com/office/word/2010/wordprocessingShape" mc:Ignorable="w14 w15 w16se w16cid w16 w16cex w16sdtdh w16sdtfl w16du wp14">
+<w:footnotes xmlns:wpc="http://schemas.microsoft.com/office/word/2010/wordprocessingCanvas" xmlns:cx="http://schemas.microsoft.com/office/drawing/2014/chartex" xmlns:cx1="http://schemas.microsoft.com/office/drawing/2015/9/8/chartex" xmlns:cx2="http://schemas.microsoft.com/office/drawing/2015/10/21/chartex" xmlns:cx3="http://schemas.microsoft.com/office/drawing/2016/5/9/chartex" xmlns:cx4="http://schemas.microsoft.com/office/drawing/2016/5/10/chartex" xmlns:cx5="http://schemas.microsoft.com/office/drawing/2016/5/11/chartex" xmlns:cx6="http://schemas.microsoft.com/office/drawing/2016/5/12/chartex" xmlns:cx7="http://schemas.microsoft.com/office/drawing/2016/5/13/chartex" xmlns:cx8="http://schemas.microsoft.com/office/drawing/2016/5/14/chartex" xmlns:mc="http://schemas.openxmlformats.org/markup-compatibility/2006" xmlns:m="http://schemas.openxmlformats.org/officeDocument/2006/math" xmlns:aink="http://schemas.microsoft.com/office/drawing/2016/ink" xmlns:am3d="http://schemas.microsoft.com/office/drawing/2017/model3d" xmlns:oel="http://schemas.microsoft.com/office/2019/extlst" xmlns:r="http://schemas.openxmlformats.org/officeDocument/2006/relationships" xmlns:wp14="http://schemas.microsoft.com/office/word/2010/wordprocessingDrawing" xmlns:wp="http://schemas.openxmlformats.org/drawingml/2006/wordprocessingDrawing" xmlns:wpg="http://schemas.microsoft.com/office/word/2010/wordprocessingGroup" xmlns:wpi="http://schemas.microsoft.com/office/word/2010/wordprocessingInk" xmlns:wps="http://schemas.microsoft.com/office/word/2010/wordprocessingShape" xmlns:o="urn:schemas-microsoft-com:office:office" xmlns:v="urn:schemas-microsoft-com:vml" xmlns:w10="urn:schemas-microsoft-com:office:word" xmlns:w="http://schemas.openxmlformats.org/wordprocessingml/2006/main" xmlns:w14="http://schemas.microsoft.com/office/word/2010/wordml" xmlns:w15="http://schemas.microsoft.com/office/word/2012/wordml" xmlns:w16cex="http://schemas.microsoft.com/office/word/2018/wordml/cex" xmlns:w16cid="http://schemas.microsoft.com/office/word/2016/wordml/cid" xmlns:w16="http://schemas.microsoft.com/office/word/2018/wordml" xmlns:w16sdtdh="http://schemas.microsoft.com/office/word/2020/wordml/sdtdatahash" xmlns:w16sdtfl="http://schemas.microsoft.com/office/word/2024/wordml/sdtformatlock" xmlns:w16se="http://schemas.microsoft.com/office/word/2015/wordml/symex" xmlns:w16du="http://schemas.microsoft.com/office/word/2023/wordml/word16du" xmlns:wne="http://schemas.microsoft.com/office/word/2006/wordml" mc:Ignorable="w14 w15 w16se w16cid w16 w16cex w16sdtdh w16sdtfl w16du wp14">
   <w:footnote w:type="separator" w:id="-1">
     <w:p>
       <w:pPr>
@@ -13802,7 +14463,7 @@
 </file>
 
 <file path=word/header1.xml><?xml version="1.0" encoding="utf-8"?>
-<w:hdr xmlns:wpc="http://schemas.microsoft.com/office/word/2010/wordprocessingCanvas" xmlns:cx="http://schemas.microsoft.com/office/drawing/2014/chartex" xmlns:cx1="http://schemas.microsoft.com/office/drawing/2015/9/8/chartex" xmlns:cx2="http://schemas.microsoft.com/office/drawing/2015/10/21/chartex" xmlns:cx3="http://schemas.microsoft.com/office/drawing/2016/5/9/chartex" xmlns:cx4="http://schemas.microsoft.com/office/drawing/2016/5/10/chartex" xmlns:cx5="http://schemas.microsoft.com/office/drawing/2016/5/11/chartex" xmlns:cx6="http://schemas.microsoft.com/office/drawing/2016/5/12/chartex" xmlns:cx7="http://schemas.microsoft.com/office/drawing/2016/5/13/chartex" xmlns:cx8="http://schemas.microsoft.com/office/drawing/2016/5/14/chartex" xmlns:mc="http://schemas.openxmlformats.org/markup-compatibility/2006" xmlns:aink="http://schemas.microsoft.com/office/drawing/2016/ink" xmlns:am3d="http://schemas.microsoft.com/office/drawing/2017/model3d" xmlns:o="urn:schemas-microsoft-com:office:office" xmlns:oel="http://schemas.microsoft.com/office/2019/extlst" xmlns:r="http://schemas.openxmlformats.org/officeDocument/2006/relationships" xmlns:m="http://schemas.openxmlformats.org/officeDocument/2006/math" xmlns:v="urn:schemas-microsoft-com:vml" xmlns:wp14="http://schemas.microsoft.com/office/word/2010/wordprocessingDrawing" xmlns:wp="http://schemas.openxmlformats.org/drawingml/2006/wordprocessingDrawing" xmlns:w10="urn:schemas-microsoft-com:office:word" xmlns:w="http://schemas.openxmlformats.org/wordprocessingml/2006/main" xmlns:w14="http://schemas.microsoft.com/office/word/2010/wordml" xmlns:w15="http://schemas.microsoft.com/office/word/2012/wordml" xmlns:w16cex="http://schemas.microsoft.com/office/word/2018/wordml/cex" xmlns:w16cid="http://schemas.microsoft.com/office/word/2016/wordml/cid" xmlns:w16="http://schemas.microsoft.com/office/word/2018/wordml" xmlns:w16du="http://schemas.microsoft.com/office/word/2023/wordml/word16du" xmlns:w16sdtdh="http://schemas.microsoft.com/office/word/2020/wordml/sdtdatahash" xmlns:w16sdtfl="http://schemas.microsoft.com/office/word/2024/wordml/sdtformatlock" xmlns:w16se="http://schemas.microsoft.com/office/word/2015/wordml/symex" xmlns:wpg="http://schemas.microsoft.com/office/word/2010/wordprocessingGroup" xmlns:wpi="http://schemas.microsoft.com/office/word/2010/wordprocessingInk" xmlns:wne="http://schemas.microsoft.com/office/word/2006/wordml" xmlns:wps="http://schemas.microsoft.com/office/word/2010/wordprocessingShape" mc:Ignorable="w14 w15 w16se w16cid w16 w16cex w16sdtdh w16sdtfl w16du wp14">
+<w:hdr xmlns:wpc="http://schemas.microsoft.com/office/word/2010/wordprocessingCanvas" xmlns:cx="http://schemas.microsoft.com/office/drawing/2014/chartex" xmlns:cx1="http://schemas.microsoft.com/office/drawing/2015/9/8/chartex" xmlns:cx2="http://schemas.microsoft.com/office/drawing/2015/10/21/chartex" xmlns:cx3="http://schemas.microsoft.com/office/drawing/2016/5/9/chartex" xmlns:cx4="http://schemas.microsoft.com/office/drawing/2016/5/10/chartex" xmlns:cx5="http://schemas.microsoft.com/office/drawing/2016/5/11/chartex" xmlns:cx6="http://schemas.microsoft.com/office/drawing/2016/5/12/chartex" xmlns:cx7="http://schemas.microsoft.com/office/drawing/2016/5/13/chartex" xmlns:cx8="http://schemas.microsoft.com/office/drawing/2016/5/14/chartex" xmlns:mc="http://schemas.openxmlformats.org/markup-compatibility/2006" xmlns:m="http://schemas.openxmlformats.org/officeDocument/2006/math" xmlns:aink="http://schemas.microsoft.com/office/drawing/2016/ink" xmlns:am3d="http://schemas.microsoft.com/office/drawing/2017/model3d" xmlns:oel="http://schemas.microsoft.com/office/2019/extlst" xmlns:r="http://schemas.openxmlformats.org/officeDocument/2006/relationships" xmlns:wp14="http://schemas.microsoft.com/office/word/2010/wordprocessingDrawing" xmlns:wp="http://schemas.openxmlformats.org/drawingml/2006/wordprocessingDrawing" xmlns:wpg="http://schemas.microsoft.com/office/word/2010/wordprocessingGroup" xmlns:wpi="http://schemas.microsoft.com/office/word/2010/wordprocessingInk" xmlns:wps="http://schemas.microsoft.com/office/word/2010/wordprocessingShape" xmlns:o="urn:schemas-microsoft-com:office:office" xmlns:v="urn:schemas-microsoft-com:vml" xmlns:w10="urn:schemas-microsoft-com:office:word" xmlns:w="http://schemas.openxmlformats.org/wordprocessingml/2006/main" xmlns:w14="http://schemas.microsoft.com/office/word/2010/wordml" xmlns:w15="http://schemas.microsoft.com/office/word/2012/wordml" xmlns:w16cex="http://schemas.microsoft.com/office/word/2018/wordml/cex" xmlns:w16cid="http://schemas.microsoft.com/office/word/2016/wordml/cid" xmlns:w16="http://schemas.microsoft.com/office/word/2018/wordml" xmlns:w16sdtdh="http://schemas.microsoft.com/office/word/2020/wordml/sdtdatahash" xmlns:w16sdtfl="http://schemas.microsoft.com/office/word/2024/wordml/sdtformatlock" xmlns:w16se="http://schemas.microsoft.com/office/word/2015/wordml/symex" xmlns:w16du="http://schemas.microsoft.com/office/word/2023/wordml/word16du" xmlns:wne="http://schemas.microsoft.com/office/word/2006/wordml" mc:Ignorable="w14 w15 w16se w16cid w16 w16cex w16sdtdh w16sdtfl w16du wp14">
   <w:p>
     <w:pPr>
       <w:pStyle w:val="Header"/>
@@ -13821,7 +14482,7 @@
 </file>
 
 <file path=word/numbering.xml><?xml version="1.0" encoding="utf-8"?>
-<w:numbering xmlns:wpc="http://schemas.microsoft.com/office/word/2010/wordprocessingCanvas" xmlns:cx="http://schemas.microsoft.com/office/drawing/2014/chartex" xmlns:cx1="http://schemas.microsoft.com/office/drawing/2015/9/8/chartex" xmlns:cx2="http://schemas.microsoft.com/office/drawing/2015/10/21/chartex" xmlns:cx3="http://schemas.microsoft.com/office/drawing/2016/5/9/chartex" xmlns:cx4="http://schemas.microsoft.com/office/drawing/2016/5/10/chartex" xmlns:cx5="http://schemas.microsoft.com/office/drawing/2016/5/11/chartex" xmlns:cx6="http://schemas.microsoft.com/office/drawing/2016/5/12/chartex" xmlns:cx7="http://schemas.microsoft.com/office/drawing/2016/5/13/chartex" xmlns:cx8="http://schemas.microsoft.com/office/drawing/2016/5/14/chartex" xmlns:mc="http://schemas.openxmlformats.org/markup-compatibility/2006" xmlns:aink="http://schemas.microsoft.com/office/drawing/2016/ink" xmlns:am3d="http://schemas.microsoft.com/office/drawing/2017/model3d" xmlns:o="urn:schemas-microsoft-com:office:office" xmlns:oel="http://schemas.microsoft.com/office/2019/extlst" xmlns:r="http://schemas.openxmlformats.org/officeDocument/2006/relationships" xmlns:m="http://schemas.openxmlformats.org/officeDocument/2006/math" xmlns:v="urn:schemas-microsoft-com:vml" xmlns:wp14="http://schemas.microsoft.com/office/word/2010/wordprocessingDrawing" xmlns:wp="http://schemas.openxmlformats.org/drawingml/2006/wordprocessingDrawing" xmlns:w10="urn:schemas-microsoft-com:office:word" xmlns:w="http://schemas.openxmlformats.org/wordprocessingml/2006/main" xmlns:w14="http://schemas.microsoft.com/office/word/2010/wordml" xmlns:w15="http://schemas.microsoft.com/office/word/2012/wordml" xmlns:w16cex="http://schemas.microsoft.com/office/word/2018/wordml/cex" xmlns:w16cid="http://schemas.microsoft.com/office/word/2016/wordml/cid" xmlns:w16="http://schemas.microsoft.com/office/word/2018/wordml" xmlns:w16du="http://schemas.microsoft.com/office/word/2023/wordml/word16du" xmlns:w16sdtdh="http://schemas.microsoft.com/office/word/2020/wordml/sdtdatahash" xmlns:w16sdtfl="http://schemas.microsoft.com/office/word/2024/wordml/sdtformatlock" xmlns:w16se="http://schemas.microsoft.com/office/word/2015/wordml/symex" xmlns:wpg="http://schemas.microsoft.com/office/word/2010/wordprocessingGroup" xmlns:wpi="http://schemas.microsoft.com/office/word/2010/wordprocessingInk" xmlns:wne="http://schemas.microsoft.com/office/word/2006/wordml" xmlns:wps="http://schemas.microsoft.com/office/word/2010/wordprocessingShape" mc:Ignorable="w14 w15 w16se w16cid w16 w16cex w16sdtdh w16sdtfl w16du wp14">
+<w:numbering xmlns:wpc="http://schemas.microsoft.com/office/word/2010/wordprocessingCanvas" xmlns:cx="http://schemas.microsoft.com/office/drawing/2014/chartex" xmlns:cx1="http://schemas.microsoft.com/office/drawing/2015/9/8/chartex" xmlns:cx2="http://schemas.microsoft.com/office/drawing/2015/10/21/chartex" xmlns:cx3="http://schemas.microsoft.com/office/drawing/2016/5/9/chartex" xmlns:cx4="http://schemas.microsoft.com/office/drawing/2016/5/10/chartex" xmlns:cx5="http://schemas.microsoft.com/office/drawing/2016/5/11/chartex" xmlns:cx6="http://schemas.microsoft.com/office/drawing/2016/5/12/chartex" xmlns:cx7="http://schemas.microsoft.com/office/drawing/2016/5/13/chartex" xmlns:cx8="http://schemas.microsoft.com/office/drawing/2016/5/14/chartex" xmlns:mc="http://schemas.openxmlformats.org/markup-compatibility/2006" xmlns:m="http://schemas.openxmlformats.org/officeDocument/2006/math" xmlns:aink="http://schemas.microsoft.com/office/drawing/2016/ink" xmlns:am3d="http://schemas.microsoft.com/office/drawing/2017/model3d" xmlns:oel="http://schemas.microsoft.com/office/2019/extlst" xmlns:r="http://schemas.openxmlformats.org/officeDocument/2006/relationships" xmlns:wp14="http://schemas.microsoft.com/office/word/2010/wordprocessingDrawing" xmlns:wp="http://schemas.openxmlformats.org/drawingml/2006/wordprocessingDrawing" xmlns:wpg="http://schemas.microsoft.com/office/word/2010/wordprocessingGroup" xmlns:wpi="http://schemas.microsoft.com/office/word/2010/wordprocessingInk" xmlns:wps="http://schemas.microsoft.com/office/word/2010/wordprocessingShape" xmlns:o="urn:schemas-microsoft-com:office:office" xmlns:v="urn:schemas-microsoft-com:vml" xmlns:w10="urn:schemas-microsoft-com:office:word" xmlns:w="http://schemas.openxmlformats.org/wordprocessingml/2006/main" xmlns:w14="http://schemas.microsoft.com/office/word/2010/wordml" xmlns:w15="http://schemas.microsoft.com/office/word/2012/wordml" xmlns:w16cex="http://schemas.microsoft.com/office/word/2018/wordml/cex" xmlns:w16cid="http://schemas.microsoft.com/office/word/2016/wordml/cid" xmlns:w16="http://schemas.microsoft.com/office/word/2018/wordml" xmlns:w16sdtdh="http://schemas.microsoft.com/office/word/2020/wordml/sdtdatahash" xmlns:w16sdtfl="http://schemas.microsoft.com/office/word/2024/wordml/sdtformatlock" xmlns:w16se="http://schemas.microsoft.com/office/word/2015/wordml/symex" xmlns:w16du="http://schemas.microsoft.com/office/word/2023/wordml/word16du" xmlns:wne="http://schemas.microsoft.com/office/word/2006/wordml" mc:Ignorable="w14 w15 w16se w16cid w16 w16cex w16sdtdh w16sdtfl w16du wp14">
   <w:abstractNum w:abstractNumId="0" w15:restartNumberingAfterBreak="0">
     <w:nsid w:val="FFFFFF7C"/>
     <w:multiLevelType w:val="singleLevel"/>
@@ -13993,38 +14654,38 @@
       </w:rPr>
     </w:lvl>
   </w:abstractNum>
-  <w:num w:numId="1" w16cid:durableId="878589827">
+  <w:num w:numId="1" w16cid:durableId="1969580367">
     <w:abstractNumId w:val="8"/>
   </w:num>
-  <w:num w:numId="2" w16cid:durableId="1850679050">
+  <w:num w:numId="2" w16cid:durableId="1240672443">
     <w:abstractNumId w:val="6"/>
   </w:num>
-  <w:num w:numId="3" w16cid:durableId="1552377168">
+  <w:num w:numId="3" w16cid:durableId="1499037186">
     <w:abstractNumId w:val="5"/>
   </w:num>
-  <w:num w:numId="4" w16cid:durableId="220096501">
+  <w:num w:numId="4" w16cid:durableId="387996407">
     <w:abstractNumId w:val="4"/>
   </w:num>
-  <w:num w:numId="5" w16cid:durableId="868762092">
+  <w:num w:numId="5" w16cid:durableId="1875194122">
     <w:abstractNumId w:val="7"/>
   </w:num>
-  <w:num w:numId="6" w16cid:durableId="1847937403">
+  <w:num w:numId="6" w16cid:durableId="1319192131">
     <w:abstractNumId w:val="3"/>
   </w:num>
-  <w:num w:numId="7" w16cid:durableId="155077373">
+  <w:num w:numId="7" w16cid:durableId="1253514785">
     <w:abstractNumId w:val="2"/>
   </w:num>
-  <w:num w:numId="8" w16cid:durableId="251857513">
+  <w:num w:numId="8" w16cid:durableId="1134561413">
     <w:abstractNumId w:val="1"/>
   </w:num>
-  <w:num w:numId="9" w16cid:durableId="55011449">
+  <w:num w:numId="9" w16cid:durableId="1287852563">
     <w:abstractNumId w:val="0"/>
   </w:num>
 </w:numbering>
 </file>
 
 <file path=word/styles.xml><?xml version="1.0" encoding="utf-8"?>
-<w:styles xmlns:mc="http://schemas.openxmlformats.org/markup-compatibility/2006" xmlns:r="http://schemas.openxmlformats.org/officeDocument/2006/relationships" xmlns:w="http://schemas.openxmlformats.org/wordprocessingml/2006/main" xmlns:w14="http://schemas.microsoft.com/office/word/2010/wordml" xmlns:w15="http://schemas.microsoft.com/office/word/2012/wordml" xmlns:w16cex="http://schemas.microsoft.com/office/word/2018/wordml/cex" xmlns:w16cid="http://schemas.microsoft.com/office/word/2016/wordml/cid" xmlns:w16="http://schemas.microsoft.com/office/word/2018/wordml" xmlns:w16du="http://schemas.microsoft.com/office/word/2023/wordml/word16du" xmlns:w16sdtdh="http://schemas.microsoft.com/office/word/2020/wordml/sdtdatahash" xmlns:w16sdtfl="http://schemas.microsoft.com/office/word/2024/wordml/sdtformatlock" xmlns:w16se="http://schemas.microsoft.com/office/word/2015/wordml/symex" mc:Ignorable="w14 w15 w16se w16cid w16 w16cex w16sdtdh w16sdtfl w16du">
+<w:styles xmlns:mc="http://schemas.openxmlformats.org/markup-compatibility/2006" xmlns:r="http://schemas.openxmlformats.org/officeDocument/2006/relationships" xmlns:w="http://schemas.openxmlformats.org/wordprocessingml/2006/main" xmlns:w14="http://schemas.microsoft.com/office/word/2010/wordml" xmlns:w15="http://schemas.microsoft.com/office/word/2012/wordml" xmlns:w16cex="http://schemas.microsoft.com/office/word/2018/wordml/cex" xmlns:w16cid="http://schemas.microsoft.com/office/word/2016/wordml/cid" xmlns:w16="http://schemas.microsoft.com/office/word/2018/wordml" xmlns:w16sdtdh="http://schemas.microsoft.com/office/word/2020/wordml/sdtdatahash" xmlns:w16sdtfl="http://schemas.microsoft.com/office/word/2024/wordml/sdtformatlock" xmlns:w16se="http://schemas.microsoft.com/office/word/2015/wordml/symex" xmlns:w16du="http://schemas.microsoft.com/office/word/2023/wordml/word16du" mc:Ignorable="w14 w15 w16se w16cid w16 w16cex w16sdtdh w16sdtfl w16du">
   <w:docDefaults>
     <w:rPrDefault>
       <w:rPr>
@@ -25412,7 +26073,7 @@
     <w:autoRedefine/>
     <w:uiPriority w:val="39"/>
     <w:unhideWhenUsed/>
-    <w:rsid w:val="00BA36AE"/>
+    <w:rsid w:val="00D36508"/>
     <w:pPr>
       <w:spacing w:after="100"/>
     </w:pPr>
@@ -25424,7 +26085,7 @@
     <w:autoRedefine/>
     <w:uiPriority w:val="39"/>
     <w:unhideWhenUsed/>
-    <w:rsid w:val="00BA36AE"/>
+    <w:rsid w:val="00D36508"/>
     <w:pPr>
       <w:spacing w:after="100"/>
       <w:ind w:left="200"/>
@@ -25435,7 +26096,7 @@
     <w:basedOn w:val="DefaultParagraphFont"/>
     <w:uiPriority w:val="99"/>
     <w:unhideWhenUsed/>
-    <w:rsid w:val="00BA36AE"/>
+    <w:rsid w:val="00D36508"/>
     <w:rPr>
       <w:color w:val="0000FF" w:themeColor="hyperlink"/>
       <w:u w:val="single"/>

</xml_diff>